<commit_message>
Improve contract review prompts, plugin skills and draft test dossiers
</commit_message>
<xml_diff>
--- a/docs/vertragsdokumente/bautraegervertrag-lindenhain/bautraegervertrag-lindenhain.docx
+++ b/docs/vertragsdokumente/bautraegervertrag-lindenhain/bautraegervertrag-lindenhain.docx
@@ -2,10 +2,20 @@
 <file path=word/document.xml><?xml version="1.0" encoding="utf-8"?>
 <w:document xmlns:w="http://schemas.openxmlformats.org/wordprocessingml/2006/main" xmlns:m="http://schemas.openxmlformats.org/officeDocument/2006/math" xmlns:r="http://schemas.openxmlformats.org/officeDocument/2006/relationships" xmlns:o="urn:schemas-microsoft-com:office:office" xmlns:v="urn:schemas-microsoft-com:vml" xmlns:w10="urn:schemas-microsoft-com:office:word" xmlns:a="http://schemas.openxmlformats.org/drawingml/2006/main" xmlns:pic="http://schemas.openxmlformats.org/drawingml/2006/picture" xmlns:wp="http://schemas.openxmlformats.org/drawingml/2006/wordprocessingDrawing">
   <w:body>
-    <w:bookmarkStart w:id="10" w:name="bauträgervertrag"/>
+    <w:bookmarkStart w:id="9" w:name="entwurf"/>
     <w:p>
       <w:pPr>
         <w:pStyle w:val="Heading1"/>
+      </w:pPr>
+      <w:r>
+        <w:t xml:space="preserve">ENTWURF</w:t>
+      </w:r>
+    </w:p>
+    <w:bookmarkEnd w:id="9"/>
+    <w:bookmarkStart w:id="11" w:name="bauträgervertrag"/>
+    <w:p>
+      <w:pPr>
+        <w:pStyle w:val="Title"/>
       </w:pPr>
       <w:r>
         <w:t xml:space="preserve">Bauträgervertrag</w:t>
@@ -20,16 +30,16 @@
           <w:b/>
           <w:bCs/>
         </w:rPr>
-        <w:t xml:space="preserve">UR-Nr. 921/2026 LF</w:t>
-      </w:r>
-    </w:p>
-    <w:bookmarkStart w:id="9" w:name="verhandelt"/>
+        <w:t xml:space="preserve">UR-Nr. ____________________</w:t>
+      </w:r>
+    </w:p>
+    <w:bookmarkStart w:id="10" w:name="vorgesehener-beurkundungstermin"/>
     <w:p>
       <w:pPr>
         <w:pStyle w:val="Heading2"/>
       </w:pPr>
       <w:r>
-        <w:t xml:space="preserve">Verhandelt</w:t>
+        <w:t xml:space="preserve">Vorgesehener Beurkundungstermin</w:t>
       </w:r>
     </w:p>
     <w:p>
@@ -37,15 +47,15 @@
         <w:pStyle w:val="FirstParagraph"/>
       </w:pPr>
       <w:r>
-        <w:t xml:space="preserve">zu Köln, am 18. September 2026</w:t>
-      </w:r>
-    </w:p>
-    <w:p>
-      <w:pPr>
-        <w:pStyle w:val="BodyText"/>
-      </w:pPr>
-      <w:r>
-        <w:t xml:space="preserve">Vor mir, der unterzeichnenden Notarin im Bezirk des Oberlandesgerichts Köln</w:t>
+        <w:t xml:space="preserve">Köln, vorgesehen für den 18. September 2026</w:t>
+      </w:r>
+    </w:p>
+    <w:p>
+      <w:pPr>
+        <w:pStyle w:val="BodyText"/>
+      </w:pPr>
+      <w:r>
+        <w:t xml:space="preserve">Vorgesehene Notarin im Bezirk des Oberlandesgerichts Köln</w:t>
       </w:r>
     </w:p>
     <w:p>
@@ -73,7 +83,7 @@
         <w:pStyle w:val="BodyText"/>
       </w:pPr>
       <w:r>
-        <w:t xml:space="preserve">erschienen heute:</w:t>
+        <w:t xml:space="preserve">Vorgesehene Beteiligte:</w:t>
       </w:r>
     </w:p>
     <w:p>
@@ -104,7 +114,7 @@
         <w:pStyle w:val="BodyText"/>
       </w:pPr>
       <w:r>
-        <w:t xml:space="preserve">der Notarin von Person bekannt,</w:t>
+        <w:t xml:space="preserve">Identität im Beurkundungstermin festzustellen,</w:t>
       </w:r>
     </w:p>
     <w:p>
@@ -228,7 +238,7 @@
         <w:pStyle w:val="BodyText"/>
       </w:pPr>
       <w:r>
-        <w:t xml:space="preserve">ausgewiesen durch gültigen Personalausweis,</w:t>
+        <w:t xml:space="preserve">Identität im Beurkundungstermin durch gültigen Personalausweis festzustellen,</w:t>
       </w:r>
     </w:p>
     <w:p>
@@ -265,20 +275,20 @@
         <w:pStyle w:val="BodyText"/>
       </w:pPr>
       <w:r>
-        <w:t xml:space="preserve">Die Käuferin erklärte, ihr sei der beabsichtigte Text dieser Urkunde einschließlich Baubeschreibung, Teilungserklärung, Gemeinschaftsordnung, Freistellungserklärungsmuster, Energie- und Schallschutznachweis sowie Baugrundkurzbericht am 28. August 2026 elektronisch und in Papierform zur Verfügung gestellt worden. Die Notarin wies darauf hin, dass die Zweiwochenfrist des § 17 Abs. 2a Satz 2 Nr. 2 BeurkG eingehalten ist, und erläuterte der Käuferin die wesentlichen Rechtswirkungen dieses Bauträgervertrags, insbesondere Ratenfälligkeit, Sicherheiten, Abnahme, Mängelrechte, Eigentumsumschreibung und Kosten.</w:t>
-      </w:r>
-    </w:p>
-    <w:p>
-      <w:pPr>
-        <w:pStyle w:val="BodyText"/>
-      </w:pPr>
-      <w:r>
-        <w:t xml:space="preserve">Die Erschienenen baten sodann um die Beurkundung des nachstehenden</w:t>
-      </w:r>
-    </w:p>
-    <w:bookmarkEnd w:id="9"/>
+        <w:t xml:space="preserve">Nach Angabe der Käuferin wurde ihr der beabsichtigte Text einschließlich Baubeschreibung, Teilungserklärung, Gemeinschaftsordnung, Freistellungserklärungsmuster, Energie- und Schallschutznachweis sowie Baugrundkurzbericht am 28. August 2026 elektronisch und in Papierform zur Verfügung gestellt. Für den vorgesehenen Termin am 18. September 2026 ergibt dies mehr als zwei Wochen. Die tatsächliche Bereitstellung und Vollständigkeit sind im Hinblick auf § 17 Abs. 2a Satz 2 Nr. 2 BeurkG festzustellen. Die Belehrung über Ratenfälligkeit, Sicherheiten, Abnahme, Mängelrechte, Eigentumsumschreibung und Kosten ist im Beurkundungstermin vorgesehen.</w:t>
+      </w:r>
+    </w:p>
+    <w:p>
+      <w:pPr>
+        <w:pStyle w:val="BodyText"/>
+      </w:pPr>
+      <w:r>
+        <w:t xml:space="preserve">Zur Beurkundung vorgesehener Vertragstext</w:t>
+      </w:r>
+    </w:p>
     <w:bookmarkEnd w:id="10"/>
-    <w:bookmarkStart w:id="27" w:name="wohnungsbauträgervertrag-mit-auflassung"/>
+    <w:bookmarkEnd w:id="11"/>
+    <w:bookmarkStart w:id="28" w:name="wohnungsbauträgervertrag-mit-auflassung"/>
     <w:p>
       <w:pPr>
         <w:pStyle w:val="Heading1"/>
@@ -287,7 +297,7 @@
         <w:t xml:space="preserve">Wohnungsbauträgervertrag mit Auflassung</w:t>
       </w:r>
     </w:p>
-    <w:bookmarkStart w:id="11" w:name="präambel-projekt-und-vertragsunterlagen"/>
+    <w:bookmarkStart w:id="12" w:name="präambel-projekt-und-vertragsunterlagen"/>
     <w:p>
       <w:pPr>
         <w:pStyle w:val="Heading2"/>
@@ -397,8 +407,8 @@
         <w:t xml:space="preserve">0.5 Werbeaussagen, Exposés, Visualisierungen und Beratungsgespräche begründen kein selbständiges Bausoll, soweit sie nicht in dieser Urkunde, der Baubeschreibung oder den Plänen konkret übernommen sind. Sie bleiben jedoch bei der Auslegung unklarer oder lückenhafter Beschreibungen als vertragsbegleitende Umstände zu berücksichtigen.</w:t>
       </w:r>
     </w:p>
-    <w:bookmarkEnd w:id="11"/>
-    <w:bookmarkStart w:id="12" w:name="grundbuch-kaufgegenstand"/>
+    <w:bookmarkEnd w:id="12"/>
+    <w:bookmarkStart w:id="13" w:name="grundbuch-kaufgegenstand"/>
     <w:p>
       <w:pPr>
         <w:pStyle w:val="Heading2"/>
@@ -440,8 +450,8 @@
         <w:t xml:space="preserve">1.4 Die Verkäuferin schuldet die Herstellung des Kaufgegenstands und des für die Nutzung erforderlichen Gemeinschaftseigentums nach dieser Urkunde, der Baubeschreibung, den Plänen, der Baugenehmigung und den anerkannten Regeln der Technik zum Zeitpunkt der Abnahme. DIN-Normen sind technische Orientierung, ersetzen aber nicht den geschuldeten Mindeststandard der anerkannten Regeln der Technik.</w:t>
       </w:r>
     </w:p>
-    <w:bookmarkEnd w:id="12"/>
-    <w:bookmarkStart w:id="13" w:name="kaufpreis-festpreis-kosten"/>
+    <w:bookmarkEnd w:id="13"/>
+    <w:bookmarkStart w:id="14" w:name="kaufpreis-festpreis-kosten"/>
     <w:p>
       <w:pPr>
         <w:pStyle w:val="Heading2"/>
@@ -510,8 +520,8 @@
         <w:t xml:space="preserve">2.4 Eine Preisanpassung wegen allgemeiner Baukostensteigerung, Materialpreisänderung, Lieferantenwechsel, Personalknappheit, Kalkulationsfehler oder Änderung interner Projektorganisation ist ausgeschlossen. Mehrkosten können nur verlangt werden, wenn die Käuferin nach Beurkundung einen Sonderwunsch beauftragt oder einer konkret beschriebenen, rechtlich zulässigen Leistungsänderung ausdrücklich zustimmt.</w:t>
       </w:r>
     </w:p>
-    <w:bookmarkEnd w:id="13"/>
-    <w:bookmarkStart w:id="14" w:name="fälligkeit-ratenplan-sicherheit"/>
+    <w:bookmarkEnd w:id="14"/>
+    <w:bookmarkStart w:id="15" w:name="fälligkeit-ratenplan-sicherheit"/>
     <w:p>
       <w:pPr>
         <w:pStyle w:val="Heading2"/>
@@ -598,18 +608,28 @@
         <w:tblW w:type="pct" w:w="5000"/>
         <w:tblLayout w:type="fixed"/>
         <w:tblLook w:firstRow="1" w:lastRow="0" w:firstColumn="0" w:lastColumn="0" w:noHBand="0" w:noVBand="0" w:val="0020"/>
+        <w:tblBorders>
+          <w:top w:val="single" w:sz="4" w:color="D9D9D9"/>
+          <w:left w:val="single" w:sz="4" w:color="D9D9D9"/>
+          <w:bottom w:val="single" w:sz="4" w:color="D9D9D9"/>
+          <w:right w:val="single" w:sz="4" w:color="D9D9D9"/>
+          <w:insideH w:val="single" w:sz="4" w:color="D9D9D9"/>
+          <w:insideV w:val="single" w:sz="4" w:color="D9D9D9"/>
+        </w:tblBorders>
       </w:tblPr>
       <w:tblGrid>
-        <w:gridCol w:w="2376"/>
-        <w:gridCol w:w="2376"/>
-        <w:gridCol w:w="3168"/>
+        <w:gridCol w:w="737"/>
+        <w:gridCol w:w="7030"/>
+        <w:gridCol w:w="1474"/>
       </w:tblGrid>
       <w:tr>
         <w:trPr>
           <w:tblHeader w:val="on"/>
         </w:trPr>
         <w:tc>
-          <w:tcPr/>
+          <w:tcPr>
+            <w:tcW w:type="dxa" w:w="737"/>
+          </w:tcPr>
           <w:p>
             <w:pPr>
               <w:pStyle w:val="Compact"/>
@@ -620,7 +640,9 @@
           </w:p>
         </w:tc>
         <w:tc>
-          <w:tcPr/>
+          <w:tcPr>
+            <w:tcW w:type="dxa" w:w="7030"/>
+          </w:tcPr>
           <w:p>
             <w:pPr>
               <w:pStyle w:val="Compact"/>
@@ -631,7 +653,9 @@
           </w:p>
         </w:tc>
         <w:tc>
-          <w:tcPr/>
+          <w:tcPr>
+            <w:tcW w:type="dxa" w:w="1474"/>
+          </w:tcPr>
           <w:p>
             <w:pPr>
               <w:pStyle w:val="Compact"/>
@@ -645,7 +669,9 @@
       </w:tr>
       <w:tr>
         <w:tc>
-          <w:tcPr/>
+          <w:tcPr>
+            <w:tcW w:type="dxa" w:w="737"/>
+          </w:tcPr>
           <w:p>
             <w:pPr>
               <w:pStyle w:val="Compact"/>
@@ -656,7 +682,9 @@
           </w:p>
         </w:tc>
         <w:tc>
-          <w:tcPr/>
+          <w:tcPr>
+            <w:tcW w:type="dxa" w:w="7030"/>
+          </w:tcPr>
           <w:p>
             <w:pPr>
               <w:pStyle w:val="Compact"/>
@@ -667,7 +695,9 @@
           </w:p>
         </w:tc>
         <w:tc>
-          <w:tcPr/>
+          <w:tcPr>
+            <w:tcW w:type="dxa" w:w="1474"/>
+          </w:tcPr>
           <w:p>
             <w:pPr>
               <w:pStyle w:val="Compact"/>
@@ -681,7 +711,9 @@
       </w:tr>
       <w:tr>
         <w:tc>
-          <w:tcPr/>
+          <w:tcPr>
+            <w:tcW w:type="dxa" w:w="737"/>
+          </w:tcPr>
           <w:p>
             <w:pPr>
               <w:pStyle w:val="Compact"/>
@@ -692,7 +724,9 @@
           </w:p>
         </w:tc>
         <w:tc>
-          <w:tcPr/>
+          <w:tcPr>
+            <w:tcW w:type="dxa" w:w="7030"/>
+          </w:tcPr>
           <w:p>
             <w:pPr>
               <w:pStyle w:val="Compact"/>
@@ -703,7 +737,9 @@
           </w:p>
         </w:tc>
         <w:tc>
-          <w:tcPr/>
+          <w:tcPr>
+            <w:tcW w:type="dxa" w:w="1474"/>
+          </w:tcPr>
           <w:p>
             <w:pPr>
               <w:pStyle w:val="Compact"/>
@@ -717,7 +753,9 @@
       </w:tr>
       <w:tr>
         <w:tc>
-          <w:tcPr/>
+          <w:tcPr>
+            <w:tcW w:type="dxa" w:w="737"/>
+          </w:tcPr>
           <w:p>
             <w:pPr>
               <w:pStyle w:val="Compact"/>
@@ -728,7 +766,9 @@
           </w:p>
         </w:tc>
         <w:tc>
-          <w:tcPr/>
+          <w:tcPr>
+            <w:tcW w:type="dxa" w:w="7030"/>
+          </w:tcPr>
           <w:p>
             <w:pPr>
               <w:pStyle w:val="Compact"/>
@@ -739,7 +779,9 @@
           </w:p>
         </w:tc>
         <w:tc>
-          <w:tcPr/>
+          <w:tcPr>
+            <w:tcW w:type="dxa" w:w="1474"/>
+          </w:tcPr>
           <w:p>
             <w:pPr>
               <w:pStyle w:val="Compact"/>
@@ -753,7 +795,9 @@
       </w:tr>
       <w:tr>
         <w:tc>
-          <w:tcPr/>
+          <w:tcPr>
+            <w:tcW w:type="dxa" w:w="737"/>
+          </w:tcPr>
           <w:p>
             <w:pPr>
               <w:pStyle w:val="Compact"/>
@@ -764,7 +808,9 @@
           </w:p>
         </w:tc>
         <w:tc>
-          <w:tcPr/>
+          <w:tcPr>
+            <w:tcW w:type="dxa" w:w="7030"/>
+          </w:tcPr>
           <w:p>
             <w:pPr>
               <w:pStyle w:val="Compact"/>
@@ -775,7 +821,9 @@
           </w:p>
         </w:tc>
         <w:tc>
-          <w:tcPr/>
+          <w:tcPr>
+            <w:tcW w:type="dxa" w:w="1474"/>
+          </w:tcPr>
           <w:p>
             <w:pPr>
               <w:pStyle w:val="Compact"/>
@@ -789,7 +837,9 @@
       </w:tr>
       <w:tr>
         <w:tc>
-          <w:tcPr/>
+          <w:tcPr>
+            <w:tcW w:type="dxa" w:w="737"/>
+          </w:tcPr>
           <w:p>
             <w:pPr>
               <w:pStyle w:val="Compact"/>
@@ -800,7 +850,9 @@
           </w:p>
         </w:tc>
         <w:tc>
-          <w:tcPr/>
+          <w:tcPr>
+            <w:tcW w:type="dxa" w:w="7030"/>
+          </w:tcPr>
           <w:p>
             <w:pPr>
               <w:pStyle w:val="Compact"/>
@@ -811,7 +863,9 @@
           </w:p>
         </w:tc>
         <w:tc>
-          <w:tcPr/>
+          <w:tcPr>
+            <w:tcW w:type="dxa" w:w="1474"/>
+          </w:tcPr>
           <w:p>
             <w:pPr>
               <w:pStyle w:val="Compact"/>
@@ -825,7 +879,9 @@
       </w:tr>
       <w:tr>
         <w:tc>
-          <w:tcPr/>
+          <w:tcPr>
+            <w:tcW w:type="dxa" w:w="737"/>
+          </w:tcPr>
           <w:p>
             <w:pPr>
               <w:pStyle w:val="Compact"/>
@@ -836,7 +892,9 @@
           </w:p>
         </w:tc>
         <w:tc>
-          <w:tcPr/>
+          <w:tcPr>
+            <w:tcW w:type="dxa" w:w="7030"/>
+          </w:tcPr>
           <w:p>
             <w:pPr>
               <w:pStyle w:val="Compact"/>
@@ -847,7 +905,9 @@
           </w:p>
         </w:tc>
         <w:tc>
-          <w:tcPr/>
+          <w:tcPr>
+            <w:tcW w:type="dxa" w:w="1474"/>
+          </w:tcPr>
           <w:p>
             <w:pPr>
               <w:pStyle w:val="Compact"/>
@@ -861,7 +921,9 @@
       </w:tr>
       <w:tr>
         <w:tc>
-          <w:tcPr/>
+          <w:tcPr>
+            <w:tcW w:type="dxa" w:w="737"/>
+          </w:tcPr>
           <w:p>
             <w:pPr>
               <w:pStyle w:val="Compact"/>
@@ -872,7 +934,9 @@
           </w:p>
         </w:tc>
         <w:tc>
-          <w:tcPr/>
+          <w:tcPr>
+            <w:tcW w:type="dxa" w:w="7030"/>
+          </w:tcPr>
           <w:p>
             <w:pPr>
               <w:pStyle w:val="Compact"/>
@@ -883,7 +947,9 @@
           </w:p>
         </w:tc>
         <w:tc>
-          <w:tcPr/>
+          <w:tcPr>
+            <w:tcW w:type="dxa" w:w="1474"/>
+          </w:tcPr>
           <w:p>
             <w:pPr>
               <w:pStyle w:val="Compact"/>
@@ -928,8 +994,8 @@
         <w:t xml:space="preserve">3.7 Sonderwünsche werden nicht außerhalb des MaBV-Ratenplans als Vorauszahlung abgerechnet. Werden sie vor Ausführung vereinbart, werden sie entweder in den Kaufpreis und die verbleibenden Raten einbezogen oder erst nach Ausführung und Abnahme des Sonderwunsches fällig.</w:t>
       </w:r>
     </w:p>
-    <w:bookmarkEnd w:id="14"/>
-    <w:bookmarkStart w:id="15" w:name="finanzierungsvollmacht"/>
+    <w:bookmarkEnd w:id="15"/>
+    <w:bookmarkStart w:id="16" w:name="finanzierungsvollmacht"/>
     <w:p>
       <w:pPr>
         <w:pStyle w:val="Heading2"/>
@@ -962,8 +1028,8 @@
         <w:t xml:space="preserve">4.3 Die Kosten der Finanzierungsgrundpfandrechte trägt die Käuferin. Kosten der Lastenfreistellung der Globalgrundschuld der Verkäuferin trägt die Verkäuferin.</w:t>
       </w:r>
     </w:p>
-    <w:bookmarkEnd w:id="15"/>
-    <w:bookmarkStart w:id="16" w:name="baupflicht-bausoll-unterlagen"/>
+    <w:bookmarkEnd w:id="16"/>
+    <w:bookmarkStart w:id="17" w:name="baupflicht-bausoll-unterlagen"/>
     <w:p>
       <w:pPr>
         <w:pStyle w:val="Heading2"/>
@@ -1136,8 +1202,8 @@
         <w:t xml:space="preserve">5.7 Sonderwünsche werden in einer gesonderten Nachtragsvereinbarung mit Leistungsbeschreibung, Preis, Auswirkung auf Termine, Gewährleistung und Schnittstellen festgelegt. Die Verkäuferin darf einen Sonderwunsch ablehnen, wenn er Bauablauf, Genehmigung, Statik, Schall, Brand, Energie, Gewährleistung oder Rechte anderer Erwerber beeinträchtigt.</w:t>
       </w:r>
     </w:p>
-    <w:bookmarkEnd w:id="16"/>
-    <w:bookmarkStart w:id="17" w:name="fertigstellung-verzug-vertragsstrafe"/>
+    <w:bookmarkEnd w:id="17"/>
+    <w:bookmarkStart w:id="18" w:name="fertigstellung-verzug-vertragsstrafe"/>
     <w:p>
       <w:pPr>
         <w:pStyle w:val="Heading2"/>
@@ -1186,8 +1252,8 @@
         <w:t xml:space="preserve">6.5 Termine verschieben sich nicht durch pauschale Hinweise auf Lieferketten, Wetter, Krankheit oder Marktlage. Eine Terminverschiebung kommt nur in Betracht, wenn die Verkäuferin unverzüglich informiert, die konkrete Bauablaufstörung darlegt und zumutbare Beschleunigungs- und Ersatzmaßnahmen ergreift.</w:t>
       </w:r>
     </w:p>
-    <w:bookmarkEnd w:id="17"/>
-    <w:bookmarkStart w:id="18" w:name="besitzübergabe-abnahme"/>
+    <w:bookmarkEnd w:id="18"/>
+    <w:bookmarkStart w:id="19" w:name="besitzübergabe-abnahme"/>
     <w:p>
       <w:pPr>
         <w:pStyle w:val="Heading2"/>
@@ -1244,8 +1310,8 @@
         <w:t xml:space="preserve">7.6 Verweigert die Käuferin die Abnahme unter Angabe mindestens eines Mangels, findet keine Abnahmefiktion statt. Bei Verbrauchern weist die Verkäuferin in einer etwaigen Aufforderung zur Abnahme in Textform klar auf die Rechtsfolgen einer nicht erklärten oder ohne Mangelangabe verweigerten Abnahme hin.</w:t>
       </w:r>
     </w:p>
-    <w:bookmarkEnd w:id="18"/>
-    <w:bookmarkStart w:id="19" w:name="mängelrechte-verjährung-selbstvornahme"/>
+    <w:bookmarkEnd w:id="19"/>
+    <w:bookmarkStart w:id="20" w:name="mängelrechte-verjährung-selbstvornahme"/>
     <w:p>
       <w:pPr>
         <w:pStyle w:val="Heading2"/>
@@ -1294,8 +1360,8 @@
         <w:t xml:space="preserve">8.5 Die Gemeinschaft der Wohnungseigentümer übt nach § 9a Abs. 2 WEG die sich aus dem gemeinschaftlichen Eigentum ergebenden Rechte sowie solche Rechte der Wohnungseigentümer aus, die eine einheitliche Rechtsverfolgung erfordern. Die individuellen Abnahme- und Vorbehaltsrechte der Käuferin werden dadurch nicht ausgeschlossen.</w:t>
       </w:r>
     </w:p>
-    <w:bookmarkEnd w:id="19"/>
-    <w:bookmarkStart w:id="20" w:name="X4e7b9c7bc4ba1eaccb7ae4b385f6db8461125a6"/>
+    <w:bookmarkEnd w:id="20"/>
+    <w:bookmarkStart w:id="21" w:name="X4e7b9c7bc4ba1eaccb7ae4b385f6db8461125a6"/>
     <w:p>
       <w:pPr>
         <w:pStyle w:val="Heading2"/>
@@ -1336,8 +1402,8 @@
         <w:t xml:space="preserve">9.4 Die Verkäuferin übergibt der Gemeinschaft die für Betrieb, Wartung und Verwaltung erforderliche geordnete Projektdokumentation spätestens mit Fertigstellung des jeweiligen gemeinschaftlichen Anlagenteils, keinesfalls später als bei dessen Besitzübergabe. Sie umfasst Wartungsverträge, Gewährleistungsübersicht, Prüfprotokolle, Revisionsunterlagen und Kontaktdaten der ausführenden Unternehmen; frühere Herausgabezeitpunkte nach § 5.2 bleiben unberührt.</w:t>
       </w:r>
     </w:p>
-    <w:bookmarkEnd w:id="20"/>
-    <w:bookmarkStart w:id="21" w:name="X0ce4c3bf0f91ec43ae492607ab14ef0476b64ee"/>
+    <w:bookmarkEnd w:id="21"/>
+    <w:bookmarkStart w:id="22" w:name="X0ce4c3bf0f91ec43ae492607ab14ef0476b64ee"/>
     <w:p>
       <w:pPr>
         <w:pStyle w:val="Heading2"/>
@@ -1378,8 +1444,8 @@
         <w:t xml:space="preserve">10.4 Die Parteien sind über den Eigentumsübergang einig. Sie bewilligen und beantragen die Eigentumsumschreibung auf die Käuferin. Die Notarin wird angewiesen, die Eigentumsumschreibung erst zu beantragen, wenn der Kaufpreis fällig und gezahlt oder hinsichtlich streitiger Restbeträge berechtigt hinterlegt oder gesichert ist, die steuerliche Unbedenklichkeitsbescheinigung vorliegt und die Lastenfreistellung gesichert ist.</w:t>
       </w:r>
     </w:p>
-    <w:bookmarkEnd w:id="21"/>
-    <w:bookmarkStart w:id="22" w:name="rücktritt-rückabwicklung-insolvenzrisiko"/>
+    <w:bookmarkEnd w:id="22"/>
+    <w:bookmarkStart w:id="23" w:name="rücktritt-rückabwicklung-insolvenzrisiko"/>
     <w:p>
       <w:pPr>
         <w:pStyle w:val="Heading2"/>
@@ -1412,8 +1478,8 @@
         <w:t xml:space="preserve">11.3 Wird nach Vertragsschluss erkennbar, dass der Anspruch der vorleistungspflichtigen Käuferin auf die Gegenleistung durch mangelnde Leistungsfähigkeit der Verkäuferin gefährdet wird, kann die Käuferin ihre Leistung nach § 321 BGB verweigern, bis die Gegenleistung bewirkt oder hierfür Sicherheit geleistet wird. Bloße Gerüchte oder allgemeine Marktlagen genügen nicht. Gesetzliche Rechte im Insolvenzfall bleiben unberührt.</w:t>
       </w:r>
     </w:p>
-    <w:bookmarkEnd w:id="22"/>
-    <w:bookmarkStart w:id="23" w:name="datenschutz-kommunikation-zustellungen"/>
+    <w:bookmarkEnd w:id="23"/>
+    <w:bookmarkStart w:id="24" w:name="datenschutz-kommunikation-zustellungen"/>
     <w:p>
       <w:pPr>
         <w:pStyle w:val="Heading2"/>
@@ -1438,8 +1504,8 @@
         <w:t xml:space="preserve">12.2 Die Verkäuferin verarbeitet personenbezogene Daten der Käuferin nur zur Vorbereitung, Durchführung und Abwicklung dieses Vertrags, zur Erfüllung gesetzlicher Pflichten und zur ordnungsgemäßen Verwaltung der Gemeinschaft. Eine Weitergabe an Planer, Bauleitung, Verwaltung, Bank, Notariat und Behörden erfolgt nur, soweit dies hierfür erforderlich ist.</w:t>
       </w:r>
     </w:p>
-    <w:bookmarkEnd w:id="23"/>
-    <w:bookmarkStart w:id="24" w:name="schlussbestimmungen-belehrungen-kosten"/>
+    <w:bookmarkEnd w:id="24"/>
+    <w:bookmarkStart w:id="25" w:name="schlussbestimmungen-belehrungen-kosten"/>
     <w:p>
       <w:pPr>
         <w:pStyle w:val="Heading2"/>
@@ -1469,7 +1535,7 @@
         <w:pStyle w:val="BodyText"/>
       </w:pPr>
       <w:r>
-        <w:t xml:space="preserve">13.3 Die Notarin belehrte insbesondere über die Wirkungen der Auflassungsvormerkung, die MaBV-Fälligkeitsvoraussetzungen, den 5-%-Sicherheitseinbehalt, die Bedeutung der Abnahme, die Mängelverjährung, die Lastenfreistellung, die Grunderwerbsteuer, die Eigentumsumschreibung und die Bedeutung der mitbeurkundeten Baubeschreibung.</w:t>
+        <w:t xml:space="preserve">13.3 Im Beurkundungstermin soll die Notarin insbesondere über die Wirkungen der Auflassungsvormerkung, die MaBV-Fälligkeitsvoraussetzungen, den 5-%-Sicherheitseinbehalt, die Bedeutung der Abnahme, die Mängelverjährung, die Lastenfreistellung, die Grunderwerbsteuer, die Eigentumsumschreibung und die Bedeutung der zur Mitbeurkundung vorgesehenen Baubeschreibung belehren.</w:t>
       </w:r>
     </w:p>
     <w:p>
@@ -1488,8 +1554,8 @@
         <w:t xml:space="preserve">13.5 Der Geschäftswert dieser Urkunde beträgt 742.000,00 EUR.</w:t>
       </w:r>
     </w:p>
-    <w:bookmarkEnd w:id="24"/>
-    <w:bookmarkStart w:id="25" w:name="auflassung"/>
+    <w:bookmarkEnd w:id="25"/>
+    <w:bookmarkStart w:id="26" w:name="auflassung"/>
     <w:p>
       <w:pPr>
         <w:pStyle w:val="Heading2"/>
@@ -1506,8 +1572,8 @@
         <w:t xml:space="preserve">Die Verkäuferin und die Käuferin sind darüber einig, dass das Eigentum an dem in § 1 bezeichneten Wohnungseigentum auf die Käuferin übergeht. Die Eintragung des Eigentumswechsels im Grundbuch wird bewilligt und beantragt. Die Notarin wird angewiesen, den Antrag nach Maßgabe des § 10.4 einzureichen.</w:t>
       </w:r>
     </w:p>
-    <w:bookmarkEnd w:id="25"/>
-    <w:bookmarkStart w:id="26" w:name="vorlesen-genehmigung-ausfertigungen"/>
+    <w:bookmarkEnd w:id="26"/>
+    <w:bookmarkStart w:id="27" w:name="vorlesen-genehmigung-ausfertigungen"/>
     <w:p>
       <w:pPr>
         <w:pStyle w:val="Heading2"/>
@@ -1521,15 +1587,15 @@
         <w:pStyle w:val="FirstParagraph"/>
       </w:pPr>
       <w:r>
-        <w:t xml:space="preserve">Diese Niederschrift wurde den Erschienenen von der Notarin vorgelesen, von ihnen genehmigt und eigenhändig unterschrieben.</w:t>
-      </w:r>
-    </w:p>
-    <w:p>
-      <w:pPr>
-        <w:pStyle w:val="BodyText"/>
-      </w:pPr>
-      <w:r>
-        <w:t xml:space="preserve">Köln, den 18. September 2026</w:t>
+        <w:t xml:space="preserve">Verlesung, Genehmigung und Unterzeichnung dieser Niederschrift einschließlich der Anlage Baubeschreibung stehen noch aus. Die nachstehenden Unterschriftsfelder bleiben im Entwurf frei.</w:t>
+      </w:r>
+    </w:p>
+    <w:p>
+      <w:pPr>
+        <w:pStyle w:val="BodyText"/>
+      </w:pPr>
+      <w:r>
+        <w:t xml:space="preserve">Ort und Datum: ____________________</w:t>
       </w:r>
     </w:p>
     <w:p>
@@ -1576,9 +1642,9 @@
         <w:t xml:space="preserve">Dr. Miriam Falkenried, Notarin</w:t>
       </w:r>
     </w:p>
-    <w:bookmarkEnd w:id="26"/>
     <w:bookmarkEnd w:id="27"/>
-    <w:bookmarkStart w:id="40" w:name="anlage-baubeschreibung"/>
+    <w:bookmarkEnd w:id="28"/>
+    <w:bookmarkStart w:id="41" w:name="anlage-baubeschreibung"/>
     <w:p>
       <w:pPr>
         <w:pStyle w:val="Heading1"/>
@@ -1588,7 +1654,19 @@
         <w:t xml:space="preserve">Anlage: Baubeschreibung</w:t>
       </w:r>
     </w:p>
-    <w:bookmarkStart w:id="28" w:name="bauvorhaben-und-planstand"/>
+    <w:p>
+      <w:pPr>
+        <w:pStyle w:val="FirstParagraph"/>
+      </w:pPr>
+      <w:r>
+        <w:rPr>
+          <w:b/>
+          <w:bCs/>
+        </w:rPr>
+        <w:t xml:space="preserve">ENTWURF</w:t>
+      </w:r>
+    </w:p>
+    <w:bookmarkStart w:id="29" w:name="bauvorhaben-und-planstand"/>
     <w:p>
       <w:pPr>
         <w:pStyle w:val="Heading2"/>
@@ -1647,11 +1725,11 @@
         <w:pStyle w:val="BodyText"/>
       </w:pPr>
       <w:r>
-        <w:t xml:space="preserve">Diese Baubeschreibung ist mit dem Bauträgervertrag mitbeurkundet und bestimmt das Bausoll für die Einheit B-05 sowie das für ihre Nutzung erforderliche Gemeinschaftseigentum.</w:t>
-      </w:r>
-    </w:p>
-    <w:bookmarkEnd w:id="28"/>
-    <w:bookmarkStart w:id="29" w:name="grundstück-erschließung-außenanlagen"/>
+        <w:t xml:space="preserve">Diese Baubeschreibung ist zur Mitbeurkundung mit dem Bauträgervertrag vorgesehen und bestimmt das Bausoll für die Einheit B-05 sowie das für ihre Nutzung erforderliche Gemeinschaftseigentum.</w:t>
+      </w:r>
+    </w:p>
+    <w:bookmarkEnd w:id="29"/>
+    <w:bookmarkStart w:id="30" w:name="grundstück-erschließung-außenanlagen"/>
     <w:p>
       <w:pPr>
         <w:pStyle w:val="Heading2"/>
@@ -1684,8 +1762,8 @@
         <w:t xml:space="preserve">1.3 Das Dach erhält ein Retentionsgründach mit Photovoltaikanlage zur Versorgung gemeinschaftlicher Verbraucher und nach Maßgabe des Messkonzepts anteilig der Wohnungen. Einzelheiten der Abrechnung werden in der Gemeinschaftsordnung und im späteren Betreiberkonzept beschrieben.</w:t>
       </w:r>
     </w:p>
-    <w:bookmarkEnd w:id="29"/>
-    <w:bookmarkStart w:id="30" w:name="baugrund-gründung-abdichtung"/>
+    <w:bookmarkEnd w:id="30"/>
+    <w:bookmarkStart w:id="31" w:name="baugrund-gründung-abdichtung"/>
     <w:p>
       <w:pPr>
         <w:pStyle w:val="Heading2"/>
@@ -1718,8 +1796,8 @@
         <w:t xml:space="preserve">2.3 Die Verkäuferin dokumentiert Abdichtungsarbeiten durch Ausführungsunterlagen, Fotodokumentation wesentlicher Arbeitsschritte und Fachunternehmererklärung.</w:t>
       </w:r>
     </w:p>
-    <w:bookmarkEnd w:id="30"/>
-    <w:bookmarkStart w:id="31" w:name="konstruktion-gebäudehülle"/>
+    <w:bookmarkEnd w:id="31"/>
+    <w:bookmarkStart w:id="32" w:name="konstruktion-gebäudehülle"/>
     <w:p>
       <w:pPr>
         <w:pStyle w:val="Heading2"/>
@@ -1760,8 +1838,8 @@
         <w:t xml:space="preserve">3.4 Wohnungseingangstür: dichtschließende Tür mit erhöhtem Schallschutz, Mehrfachverriegelung, Spion, Sicherheitsbeschlag und einheitlicher Oberfläche nach Bemusterungslinie Lindenhain Komfort.</w:t>
       </w:r>
     </w:p>
-    <w:bookmarkEnd w:id="31"/>
-    <w:bookmarkStart w:id="32" w:name="energie-heizung-lüftung-sanitär"/>
+    <w:bookmarkEnd w:id="32"/>
+    <w:bookmarkStart w:id="33" w:name="energie-heizung-lüftung-sanitär"/>
     <w:p>
       <w:pPr>
         <w:pStyle w:val="Heading2"/>
@@ -1802,8 +1880,8 @@
         <w:t xml:space="preserve">4.4 Bad und Gäste-WC erhalten weiße Sanitärobjekte der Bemusterungslinie Lindenhain Komfort, bodengleiche Dusche im Bad, Waschtisch, wandhängendes WC, verchromte Armaturen eines Markenherstellers und Handtuchheizkörper elektrisch oder warmwassergeführt nach Planung.</w:t>
       </w:r>
     </w:p>
-    <w:bookmarkEnd w:id="32"/>
-    <w:bookmarkStart w:id="33" w:name="elektro-medien-sicherheit"/>
+    <w:bookmarkEnd w:id="33"/>
+    <w:bookmarkStart w:id="34" w:name="elektro-medien-sicherheit"/>
     <w:p>
       <w:pPr>
         <w:pStyle w:val="Heading2"/>
@@ -1836,8 +1914,8 @@
         <w:t xml:space="preserve">5.3 Gemeinschaftsbereiche erhalten energiesparende Beleuchtung, Bewegungsmelder in Fluren, Keller und Tiefgarage sowie eine ausreichend beleuchtete Hausnummer und Klingelanlage.</w:t>
       </w:r>
     </w:p>
-    <w:bookmarkEnd w:id="33"/>
-    <w:bookmarkStart w:id="34" w:name="innenausbau-oberflächen-türen"/>
+    <w:bookmarkEnd w:id="34"/>
+    <w:bookmarkStart w:id="35" w:name="innenausbau-oberflächen-türen"/>
     <w:p>
       <w:pPr>
         <w:pStyle w:val="Heading2"/>
@@ -1878,8 +1956,8 @@
         <w:t xml:space="preserve">6.4 Balkon oder Loggia der Einheit B-05 wird mit frostsicherem Belag, Entwässerung, Außensteckdose und Außenleuchte hergestellt.</w:t>
       </w:r>
     </w:p>
-    <w:bookmarkEnd w:id="34"/>
-    <w:bookmarkStart w:id="35" w:name="schallschutz-brandschutz-barrierearmut"/>
+    <w:bookmarkEnd w:id="35"/>
+    <w:bookmarkStart w:id="36" w:name="schallschutz-brandschutz-barrierearmut"/>
     <w:p>
       <w:pPr>
         <w:pStyle w:val="Heading2"/>
@@ -1912,8 +1990,8 @@
         <w:t xml:space="preserve">7.3 Der Hauszugang, der Aufzug, die Flure und die Wohnung B-05 werden barrierearm nutzbar ausgeführt. Eine vollständige Barrierefreiheit nach DIN 18040 ist nur geschuldet, soweit sie ausdrücklich in den Plänen bezeichnet ist.</w:t>
       </w:r>
     </w:p>
-    <w:bookmarkEnd w:id="35"/>
-    <w:bookmarkStart w:id="36" w:name="X2886e964c029d0082887e07f9ac0c09187785e3"/>
+    <w:bookmarkEnd w:id="36"/>
+    <w:bookmarkStart w:id="37" w:name="X2886e964c029d0082887e07f9ac0c09187785e3"/>
     <w:p>
       <w:pPr>
         <w:pStyle w:val="Heading2"/>
@@ -1946,8 +2024,8 @@
         <w:t xml:space="preserve">8.3 Fahrradraum, Kinderwagenraum, Müllraum und Paketstation werden spätestens bei Bezugsfertigkeit nutzbar hergestellt.</w:t>
       </w:r>
     </w:p>
-    <w:bookmarkEnd w:id="36"/>
-    <w:bookmarkStart w:id="37" w:name="bemusterung-auswahlrechte"/>
+    <w:bookmarkEnd w:id="37"/>
+    <w:bookmarkStart w:id="38" w:name="bemusterung-auswahlrechte"/>
     <w:p>
       <w:pPr>
         <w:pStyle w:val="Heading2"/>
@@ -1980,8 +2058,8 @@
         <w:t xml:space="preserve">9.3 Sonderwünsche außerhalb der Bemusterungslinie werden nur nach schriftlicher Beschreibung, Preisangabe, Terminfolge und technischer Prüfung ausgeführt.</w:t>
       </w:r>
     </w:p>
-    <w:bookmarkEnd w:id="37"/>
-    <w:bookmarkStart w:id="38" w:name="unterlagen-wartung-übergabe"/>
+    <w:bookmarkEnd w:id="38"/>
+    <w:bookmarkStart w:id="39" w:name="unterlagen-wartung-übergabe"/>
     <w:p>
       <w:pPr>
         <w:pStyle w:val="Heading2"/>
@@ -2014,8 +2092,8 @@
         <w:t xml:space="preserve">10.3 Wartungsbedürftige Anlagen werden so beschrieben, dass die Gemeinschaft nach Übergabe eigenständig Wartungsverträge prüfen, übernehmen oder neu vergeben kann.</w:t>
       </w:r>
     </w:p>
-    <w:bookmarkEnd w:id="38"/>
-    <w:bookmarkStart w:id="39" w:name="fertigstellung-der-baubeschreibung"/>
+    <w:bookmarkEnd w:id="39"/>
+    <w:bookmarkStart w:id="40" w:name="fertigstellung-der-baubeschreibung"/>
     <w:p>
       <w:pPr>
         <w:pStyle w:val="Heading2"/>
@@ -2048,12 +2126,15 @@
         <w:t xml:space="preserve">Lindenhain Wohnwerte GmbH &amp; Co. KG</w:t>
       </w:r>
     </w:p>
-    <w:bookmarkEnd w:id="39"/>
     <w:bookmarkEnd w:id="40"/>
+    <w:bookmarkEnd w:id="41"/>
     <w:sectPr>
+      <w:headerReference w:type="default" r:id="rId9"/>
       <w:footnotePr>
         <w:numRestart w:val="eachSect"/>
       </w:footnotePr>
+      <w:pgSz w:w="11906" w:h="16838"/>
+      <w:pgMar w:top="1247" w:bottom="1247" w:left="1417" w:right="1247"/>
     </w:sectPr>
   </w:body>
 </w:document>
@@ -2080,6 +2161,23 @@
     </w:p>
   </w:footnote>
 </w:footnotes>
+</file>
+
+<file path=word/header1.xml><?xml version="1.0" encoding="utf-8"?>
+<w:hdr xmlns:m="http://schemas.openxmlformats.org/officeDocument/2006/math" xmlns:mc="http://schemas.openxmlformats.org/markup-compatibility/2006" xmlns:mo="http://schemas.microsoft.com/office/mac/office/2008/main" xmlns:mv="urn:schemas-microsoft-com:mac:vml" xmlns:o="urn:schemas-microsoft-com:office:office" xmlns:r="http://schemas.openxmlformats.org/officeDocument/2006/relationships" xmlns:v="urn:schemas-microsoft-com:vml" xmlns:w10="urn:schemas-microsoft-com:office:word" xmlns:w14="http://schemas.microsoft.com/office/word/2010/wordml" xmlns:w="http://schemas.openxmlformats.org/wordprocessingml/2006/main" xmlns:wne="http://schemas.microsoft.com/office/word/2006/wordml" xmlns:wp14="http://schemas.microsoft.com/office/word/2010/wordprocessingDrawing" xmlns:wp="http://schemas.openxmlformats.org/drawingml/2006/wordprocessingDrawing" xmlns:wpc="http://schemas.microsoft.com/office/word/2010/wordprocessingCanvas" xmlns:wpg="http://schemas.microsoft.com/office/word/2010/wordprocessingGroup" xmlns:wpi="http://schemas.microsoft.com/office/word/2010/wordprocessingInk" xmlns:wps="http://schemas.microsoft.com/office/word/2010/wordprocessingShape" mc:Ignorable="w14 wp14">
+  <w:p>
+    <w:pPr>
+      <w:pStyle w:val="Header"/>
+    </w:pPr>
+    <w:r>
+      <w:rPr>
+        <w:b/>
+        <w:sz w:val="18"/>
+      </w:rPr>
+      <w:t>ENTWURF</w:t>
+    </w:r>
+  </w:p>
+</w:hdr>
 </file>
 
 <file path=word/numbering.xml><?xml version="1.0" encoding="utf-8"?>
@@ -2296,6 +2394,14 @@
   <w:style w:default="1" w:styleId="Normal" w:type="paragraph">
     <w:name w:val="Normal"/>
     <w:qFormat/>
+    <w:pPr>
+      <w:spacing w:line="269" w:lineRule="auto"/>
+    </w:pPr>
+    <w:rPr>
+      <w:rFonts w:ascii="Times New Roman" w:hAnsi="Times New Roman"/>
+      <w:color w:val="000000"/>
+      <w:sz w:val="22"/>
+    </w:rPr>
   </w:style>
   <w:style w:styleId="BodyText" w:type="paragraph">
     <w:name w:val="Body Text"/>
@@ -2305,12 +2411,18 @@
     <w:pPr>
       <w:spacing w:after="180" w:before="180"/>
     </w:pPr>
+    <w:rPr>
+      <w:color w:val="000000"/>
+    </w:rPr>
   </w:style>
   <w:style w:customStyle="1" w:styleId="FirstParagraph" w:type="paragraph">
     <w:name w:val="First Paragraph"/>
     <w:basedOn w:val="BodyText"/>
     <w:next w:val="BodyText"/>
     <w:qFormat/>
+    <w:rPr>
+      <w:color w:val="000000"/>
+    </w:rPr>
   </w:style>
   <w:style w:customStyle="1" w:styleId="Compact" w:type="paragraph">
     <w:name w:val="Compact"/>
@@ -2319,6 +2431,9 @@
     <w:pPr>
       <w:spacing w:after="36" w:before="36"/>
     </w:pPr>
+    <w:rPr>
+      <w:color w:val="000000"/>
+    </w:rPr>
   </w:style>
   <w:style w:styleId="Title" w:type="paragraph">
     <w:name w:val="Title"/>
@@ -2335,6 +2450,7 @@
     </w:pPr>
     <w:rPr>
       <w:rFonts w:asciiTheme="majorHAnsi" w:cstheme="majorBidi" w:eastAsiaTheme="majorEastAsia" w:hAnsiTheme="majorHAnsi"/>
+      <w:color w:val="000000"/>
       <w:sz w:val="56"/>
       <w:szCs w:val="56"/>
     </w:rPr>
@@ -2366,6 +2482,7 @@
     </w:pPr>
     <w:rPr>
       <w:rFonts w:cstheme="majorBidi" w:eastAsiaTheme="majorEastAsia"/>
+      <w:color w:val="000000"/>
       <w:spacing w:val="15"/>
       <w:sz w:val="28"/>
       <w:szCs w:val="28"/>
@@ -2395,6 +2512,7 @@
       <w:keepLines/>
     </w:pPr>
     <w:rPr>
+      <w:color w:val="000000"/>
       <w:sz w:val="24"/>
       <w:szCs w:val="24"/>
     </w:rPr>
@@ -2409,6 +2527,7 @@
       <w:keepLines/>
     </w:pPr>
     <w:rPr>
+      <w:color w:val="000000"/>
       <w:sz w:val="24"/>
       <w:szCs w:val="24"/>
     </w:rPr>
@@ -2426,6 +2545,7 @@
     </w:pPr>
     <w:rPr>
       <w:b/>
+      <w:color w:val="000000"/>
       <w:sz w:val="20"/>
       <w:szCs w:val="20"/>
     </w:rPr>
@@ -2441,6 +2561,7 @@
       <w:spacing w:after="300" w:before="100"/>
     </w:pPr>
     <w:rPr>
+      <w:color w:val="000000"/>
       <w:sz w:val="20"/>
       <w:szCs w:val="20"/>
     </w:rPr>
@@ -2451,7 +2572,9 @@
     <w:next w:val="Bibliography"/>
     <w:qFormat/>
     <w:pPr/>
-    <w:rPr/>
+    <w:rPr>
+      <w:color w:val="000000"/>
+    </w:rPr>
   </w:style>
   <w:style w:styleId="Heading1" w:type="paragraph">
     <w:name w:val="heading 1"/>
@@ -2469,7 +2592,7 @@
     </w:pPr>
     <w:rPr>
       <w:rFonts w:asciiTheme="majorHAnsi" w:cstheme="majorBidi" w:eastAsiaTheme="majorEastAsia" w:hAnsiTheme="majorHAnsi"/>
-      <w:color w:themeColor="accent1" w:themeShade="BF" w:val="0F4761"/>
+      <w:color w:val="000000"/>
       <w:sz w:val="40"/>
       <w:szCs w:val="40"/>
     </w:rPr>
@@ -2492,7 +2615,7 @@
     </w:pPr>
     <w:rPr>
       <w:rFonts w:asciiTheme="majorHAnsi" w:cstheme="majorBidi" w:eastAsiaTheme="majorEastAsia" w:hAnsiTheme="majorHAnsi"/>
-      <w:color w:themeColor="accent1" w:themeShade="BF" w:val="0F4761"/>
+      <w:color w:val="000000"/>
       <w:sz w:val="32"/>
       <w:szCs w:val="32"/>
     </w:rPr>
@@ -2515,7 +2638,7 @@
     </w:pPr>
     <w:rPr>
       <w:rFonts w:cstheme="majorBidi" w:eastAsiaTheme="majorEastAsia"/>
-      <w:color w:themeColor="accent1" w:themeShade="BF" w:val="0F4761"/>
+      <w:color w:val="000000"/>
       <w:sz w:val="28"/>
       <w:szCs w:val="28"/>
     </w:rPr>
@@ -2540,7 +2663,7 @@
       <w:rFonts w:cstheme="majorBidi" w:eastAsiaTheme="majorEastAsia"/>
       <w:i/>
       <w:iCs/>
-      <w:color w:themeColor="accent1" w:themeShade="BF" w:val="0F4761"/>
+      <w:color w:val="000000"/>
     </w:rPr>
   </w:style>
   <w:style w:styleId="Heading5" w:type="paragraph">
@@ -2561,7 +2684,7 @@
     </w:pPr>
     <w:rPr>
       <w:rFonts w:cstheme="majorBidi" w:eastAsiaTheme="majorEastAsia"/>
-      <w:color w:themeColor="accent1" w:themeShade="BF" w:val="0F4761"/>
+      <w:color w:val="000000"/>
     </w:rPr>
   </w:style>
   <w:style w:styleId="Heading6" w:type="paragraph">
@@ -2584,7 +2707,7 @@
       <w:rFonts w:cstheme="majorBidi" w:eastAsiaTheme="majorEastAsia"/>
       <w:i/>
       <w:iCs/>
-      <w:color w:themeColor="text1" w:themeTint="A6" w:val="595959"/>
+      <w:color w:val="000000"/>
     </w:rPr>
   </w:style>
   <w:style w:styleId="Heading7" w:type="paragraph">
@@ -2605,7 +2728,7 @@
     </w:pPr>
     <w:rPr>
       <w:rFonts w:cstheme="majorBidi" w:eastAsiaTheme="majorEastAsia"/>
-      <w:color w:themeColor="text1" w:themeTint="A6" w:val="595959"/>
+      <w:color w:val="000000"/>
     </w:rPr>
   </w:style>
   <w:style w:styleId="Heading8" w:type="paragraph">
@@ -2628,7 +2751,7 @@
       <w:rFonts w:cstheme="majorBidi" w:eastAsiaTheme="majorEastAsia"/>
       <w:i/>
       <w:iCs/>
-      <w:color w:themeColor="text1" w:themeTint="D8" w:val="272727"/>
+      <w:color w:val="000000"/>
     </w:rPr>
   </w:style>
   <w:style w:styleId="Heading9" w:type="paragraph">
@@ -2649,7 +2772,7 @@
     </w:pPr>
     <w:rPr>
       <w:rFonts w:cstheme="majorBidi" w:eastAsiaTheme="majorEastAsia"/>
-      <w:color w:themeColor="text1" w:themeTint="D8" w:val="272727"/>
+      <w:color w:val="000000"/>
     </w:rPr>
   </w:style>
   <w:style w:customStyle="1" w:styleId="Heading1Char" w:type="character">
@@ -2782,6 +2905,9 @@
       <w:spacing w:after="100" w:before="100"/>
       <w:ind w:firstLine="0" w:left="480" w:right="480"/>
     </w:pPr>
+    <w:rPr>
+      <w:color w:val="000000"/>
+    </w:rPr>
   </w:style>
   <w:style w:styleId="FootnoteText" w:type="paragraph">
     <w:name w:val="Footnote Text"/>
@@ -2790,6 +2916,9 @@
     <w:uiPriority w:val="9"/>
     <w:unhideWhenUsed/>
     <w:qFormat/>
+    <w:rPr>
+      <w:color w:val="000000"/>
+    </w:rPr>
   </w:style>
   <w:style w:styleId="FootnoteBlockText" w:type="paragraph">
     <w:name w:val="Footnote Block Text"/>
@@ -2802,6 +2931,9 @@
       <w:spacing w:after="100" w:before="100"/>
       <w:ind w:firstLine="0" w:left="480" w:right="480"/>
     </w:pPr>
+    <w:rPr>
+      <w:color w:val="000000"/>
+    </w:rPr>
   </w:style>
   <w:style w:default="1" w:styleId="DefaultParagraphFont" w:type="character">
     <w:name w:val="Default Paragraph Font"/>
@@ -2843,11 +2975,15 @@
     </w:pPr>
     <w:rPr>
       <w:b/>
+      <w:color w:val="000000"/>
     </w:rPr>
   </w:style>
   <w:style w:customStyle="1" w:styleId="Definition" w:type="paragraph">
     <w:name w:val="Definition"/>
     <w:basedOn w:val="Normal"/>
+    <w:rPr>
+      <w:color w:val="000000"/>
+    </w:rPr>
   </w:style>
   <w:style w:styleId="Caption" w:type="paragraph">
     <w:name w:val="Caption"/>
@@ -2858,6 +2994,7 @@
     </w:pPr>
     <w:rPr>
       <w:i/>
+      <w:color w:val="000000"/>
     </w:rPr>
   </w:style>
   <w:style w:customStyle="1" w:styleId="TableCaption" w:type="paragraph">
@@ -2866,14 +3003,23 @@
     <w:pPr>
       <w:keepNext/>
     </w:pPr>
+    <w:rPr>
+      <w:color w:val="000000"/>
+    </w:rPr>
   </w:style>
   <w:style w:customStyle="1" w:styleId="ImageCaption" w:type="paragraph">
     <w:name w:val="Image Caption"/>
     <w:basedOn w:val="Caption"/>
+    <w:rPr>
+      <w:color w:val="000000"/>
+    </w:rPr>
   </w:style>
   <w:style w:customStyle="1" w:styleId="Figure" w:type="paragraph">
     <w:name w:val="Figure"/>
     <w:basedOn w:val="Normal"/>
+    <w:rPr>
+      <w:color w:val="000000"/>
+    </w:rPr>
   </w:style>
   <w:style w:customStyle="1" w:styleId="CaptionedFigure" w:type="paragraph">
     <w:name w:val="Captioned Figure"/>
@@ -2881,6 +3027,9 @@
     <w:pPr>
       <w:keepNext/>
     </w:pPr>
+    <w:rPr>
+      <w:color w:val="000000"/>
+    </w:rPr>
   </w:style>
   <w:style w:customStyle="1" w:styleId="BodyTextChar" w:type="character">
     <w:name w:val="Body Text Char"/>
@@ -2928,7 +3077,7 @@
       <w:rFonts w:asciiTheme="majorHAnsi" w:cstheme="majorBidi" w:eastAsiaTheme="majorEastAsia" w:hAnsiTheme="majorHAnsi"/>
       <w:b w:val="0"/>
       <w:bCs w:val="0"/>
-      <w:color w:themeColor="accent1" w:themeShade="BF" w:val="365F91"/>
+      <w:color w:val="000000"/>
     </w:rPr>
   </w:style>
   <w:style w:type="paragraph" w:customStyle="1" w:styleId="SourceCode">
@@ -2938,6 +3087,9 @@
     <w:pPr>
       <w:wordWrap w:val="off"/>
     </w:pPr>
+    <w:rPr>
+      <w:color w:val="000000"/>
+    </w:rPr>
   </w:style>
   <w:style w:type="character" w:customStyle="1" w:styleId="KeywordTok">
     <w:name w:val="KeywordTok"/>

</xml_diff>

<commit_message>
4.5.0: durchgehender anwaltlicher Workflow für Prompts und Plugin (#19)
* Improve contract review prompts, plugin skills and draft test dossiers

* Tighten limitation review and provide compact Word prompts

* Improve lawyer-facing review workflows and prepare 4.5.0 release
</commit_message>
<xml_diff>
--- a/docs/vertragsdokumente/bautraegervertrag-lindenhain/bautraegervertrag-lindenhain.docx
+++ b/docs/vertragsdokumente/bautraegervertrag-lindenhain/bautraegervertrag-lindenhain.docx
@@ -2,10 +2,20 @@
 <file path=word/document.xml><?xml version="1.0" encoding="utf-8"?>
 <w:document xmlns:w="http://schemas.openxmlformats.org/wordprocessingml/2006/main" xmlns:m="http://schemas.openxmlformats.org/officeDocument/2006/math" xmlns:r="http://schemas.openxmlformats.org/officeDocument/2006/relationships" xmlns:o="urn:schemas-microsoft-com:office:office" xmlns:v="urn:schemas-microsoft-com:vml" xmlns:w10="urn:schemas-microsoft-com:office:word" xmlns:a="http://schemas.openxmlformats.org/drawingml/2006/main" xmlns:pic="http://schemas.openxmlformats.org/drawingml/2006/picture" xmlns:wp="http://schemas.openxmlformats.org/drawingml/2006/wordprocessingDrawing">
   <w:body>
-    <w:bookmarkStart w:id="10" w:name="bauträgervertrag"/>
+    <w:bookmarkStart w:id="9" w:name="entwurf"/>
     <w:p>
       <w:pPr>
         <w:pStyle w:val="Heading1"/>
+      </w:pPr>
+      <w:r>
+        <w:t xml:space="preserve">ENTWURF</w:t>
+      </w:r>
+    </w:p>
+    <w:bookmarkEnd w:id="9"/>
+    <w:bookmarkStart w:id="11" w:name="bauträgervertrag"/>
+    <w:p>
+      <w:pPr>
+        <w:pStyle w:val="Title"/>
       </w:pPr>
       <w:r>
         <w:t xml:space="preserve">Bauträgervertrag</w:t>
@@ -20,16 +30,16 @@
           <w:b/>
           <w:bCs/>
         </w:rPr>
-        <w:t xml:space="preserve">UR-Nr. 921/2026 LF</w:t>
-      </w:r>
-    </w:p>
-    <w:bookmarkStart w:id="9" w:name="verhandelt"/>
+        <w:t xml:space="preserve">UR-Nr. ____________________</w:t>
+      </w:r>
+    </w:p>
+    <w:bookmarkStart w:id="10" w:name="vorgesehener-beurkundungstermin"/>
     <w:p>
       <w:pPr>
         <w:pStyle w:val="Heading2"/>
       </w:pPr>
       <w:r>
-        <w:t xml:space="preserve">Verhandelt</w:t>
+        <w:t xml:space="preserve">Vorgesehener Beurkundungstermin</w:t>
       </w:r>
     </w:p>
     <w:p>
@@ -37,15 +47,15 @@
         <w:pStyle w:val="FirstParagraph"/>
       </w:pPr>
       <w:r>
-        <w:t xml:space="preserve">zu Köln, am 18. September 2026</w:t>
-      </w:r>
-    </w:p>
-    <w:p>
-      <w:pPr>
-        <w:pStyle w:val="BodyText"/>
-      </w:pPr>
-      <w:r>
-        <w:t xml:space="preserve">Vor mir, der unterzeichnenden Notarin im Bezirk des Oberlandesgerichts Köln</w:t>
+        <w:t xml:space="preserve">Köln, vorgesehen für den 18. September 2026</w:t>
+      </w:r>
+    </w:p>
+    <w:p>
+      <w:pPr>
+        <w:pStyle w:val="BodyText"/>
+      </w:pPr>
+      <w:r>
+        <w:t xml:space="preserve">Vorgesehene Notarin im Bezirk des Oberlandesgerichts Köln</w:t>
       </w:r>
     </w:p>
     <w:p>
@@ -73,7 +83,7 @@
         <w:pStyle w:val="BodyText"/>
       </w:pPr>
       <w:r>
-        <w:t xml:space="preserve">erschienen heute:</w:t>
+        <w:t xml:space="preserve">Vorgesehene Beteiligte:</w:t>
       </w:r>
     </w:p>
     <w:p>
@@ -104,7 +114,7 @@
         <w:pStyle w:val="BodyText"/>
       </w:pPr>
       <w:r>
-        <w:t xml:space="preserve">der Notarin von Person bekannt,</w:t>
+        <w:t xml:space="preserve">Identität im Beurkundungstermin festzustellen,</w:t>
       </w:r>
     </w:p>
     <w:p>
@@ -228,7 +238,7 @@
         <w:pStyle w:val="BodyText"/>
       </w:pPr>
       <w:r>
-        <w:t xml:space="preserve">ausgewiesen durch gültigen Personalausweis,</w:t>
+        <w:t xml:space="preserve">Identität im Beurkundungstermin durch gültigen Personalausweis festzustellen,</w:t>
       </w:r>
     </w:p>
     <w:p>
@@ -265,20 +275,20 @@
         <w:pStyle w:val="BodyText"/>
       </w:pPr>
       <w:r>
-        <w:t xml:space="preserve">Die Käuferin erklärte, ihr sei der beabsichtigte Text dieser Urkunde einschließlich Baubeschreibung, Teilungserklärung, Gemeinschaftsordnung, Freistellungserklärungsmuster, Energie- und Schallschutznachweis sowie Baugrundkurzbericht am 28. August 2026 elektronisch und in Papierform zur Verfügung gestellt worden. Die Notarin wies darauf hin, dass die Zweiwochenfrist des § 17 Abs. 2a Satz 2 Nr. 2 BeurkG eingehalten ist, und erläuterte der Käuferin die wesentlichen Rechtswirkungen dieses Bauträgervertrags, insbesondere Ratenfälligkeit, Sicherheiten, Abnahme, Mängelrechte, Eigentumsumschreibung und Kosten.</w:t>
-      </w:r>
-    </w:p>
-    <w:p>
-      <w:pPr>
-        <w:pStyle w:val="BodyText"/>
-      </w:pPr>
-      <w:r>
-        <w:t xml:space="preserve">Die Erschienenen baten sodann um die Beurkundung des nachstehenden</w:t>
-      </w:r>
-    </w:p>
-    <w:bookmarkEnd w:id="9"/>
+        <w:t xml:space="preserve">Nach Angabe der Käuferin wurde ihr der beabsichtigte Text einschließlich Baubeschreibung, Teilungserklärung, Gemeinschaftsordnung, Freistellungserklärungsmuster, Energie- und Schallschutznachweis sowie Baugrundkurzbericht am 28. August 2026 elektronisch und in Papierform zur Verfügung gestellt. Für den vorgesehenen Termin am 18. September 2026 ergibt dies mehr als zwei Wochen. Die tatsächliche Bereitstellung und Vollständigkeit sind im Hinblick auf § 17 Abs. 2a Satz 2 Nr. 2 BeurkG festzustellen. Die Belehrung über Ratenfälligkeit, Sicherheiten, Abnahme, Mängelrechte, Eigentumsumschreibung und Kosten ist im Beurkundungstermin vorgesehen.</w:t>
+      </w:r>
+    </w:p>
+    <w:p>
+      <w:pPr>
+        <w:pStyle w:val="BodyText"/>
+      </w:pPr>
+      <w:r>
+        <w:t xml:space="preserve">Zur Beurkundung vorgesehener Vertragstext</w:t>
+      </w:r>
+    </w:p>
     <w:bookmarkEnd w:id="10"/>
-    <w:bookmarkStart w:id="27" w:name="wohnungsbauträgervertrag-mit-auflassung"/>
+    <w:bookmarkEnd w:id="11"/>
+    <w:bookmarkStart w:id="28" w:name="wohnungsbauträgervertrag-mit-auflassung"/>
     <w:p>
       <w:pPr>
         <w:pStyle w:val="Heading1"/>
@@ -287,7 +297,7 @@
         <w:t xml:space="preserve">Wohnungsbauträgervertrag mit Auflassung</w:t>
       </w:r>
     </w:p>
-    <w:bookmarkStart w:id="11" w:name="präambel-projekt-und-vertragsunterlagen"/>
+    <w:bookmarkStart w:id="12" w:name="präambel-projekt-und-vertragsunterlagen"/>
     <w:p>
       <w:pPr>
         <w:pStyle w:val="Heading2"/>
@@ -397,8 +407,8 @@
         <w:t xml:space="preserve">0.5 Werbeaussagen, Exposés, Visualisierungen und Beratungsgespräche begründen kein selbständiges Bausoll, soweit sie nicht in dieser Urkunde, der Baubeschreibung oder den Plänen konkret übernommen sind. Sie bleiben jedoch bei der Auslegung unklarer oder lückenhafter Beschreibungen als vertragsbegleitende Umstände zu berücksichtigen.</w:t>
       </w:r>
     </w:p>
-    <w:bookmarkEnd w:id="11"/>
-    <w:bookmarkStart w:id="12" w:name="grundbuch-kaufgegenstand"/>
+    <w:bookmarkEnd w:id="12"/>
+    <w:bookmarkStart w:id="13" w:name="grundbuch-kaufgegenstand"/>
     <w:p>
       <w:pPr>
         <w:pStyle w:val="Heading2"/>
@@ -440,8 +450,8 @@
         <w:t xml:space="preserve">1.4 Die Verkäuferin schuldet die Herstellung des Kaufgegenstands und des für die Nutzung erforderlichen Gemeinschaftseigentums nach dieser Urkunde, der Baubeschreibung, den Plänen, der Baugenehmigung und den anerkannten Regeln der Technik zum Zeitpunkt der Abnahme. DIN-Normen sind technische Orientierung, ersetzen aber nicht den geschuldeten Mindeststandard der anerkannten Regeln der Technik.</w:t>
       </w:r>
     </w:p>
-    <w:bookmarkEnd w:id="12"/>
-    <w:bookmarkStart w:id="13" w:name="kaufpreis-festpreis-kosten"/>
+    <w:bookmarkEnd w:id="13"/>
+    <w:bookmarkStart w:id="14" w:name="kaufpreis-festpreis-kosten"/>
     <w:p>
       <w:pPr>
         <w:pStyle w:val="Heading2"/>
@@ -510,8 +520,8 @@
         <w:t xml:space="preserve">2.4 Eine Preisanpassung wegen allgemeiner Baukostensteigerung, Materialpreisänderung, Lieferantenwechsel, Personalknappheit, Kalkulationsfehler oder Änderung interner Projektorganisation ist ausgeschlossen. Mehrkosten können nur verlangt werden, wenn die Käuferin nach Beurkundung einen Sonderwunsch beauftragt oder einer konkret beschriebenen, rechtlich zulässigen Leistungsänderung ausdrücklich zustimmt.</w:t>
       </w:r>
     </w:p>
-    <w:bookmarkEnd w:id="13"/>
-    <w:bookmarkStart w:id="14" w:name="fälligkeit-ratenplan-sicherheit"/>
+    <w:bookmarkEnd w:id="14"/>
+    <w:bookmarkStart w:id="15" w:name="fälligkeit-ratenplan-sicherheit"/>
     <w:p>
       <w:pPr>
         <w:pStyle w:val="Heading2"/>
@@ -598,18 +608,28 @@
         <w:tblW w:type="pct" w:w="5000"/>
         <w:tblLayout w:type="fixed"/>
         <w:tblLook w:firstRow="1" w:lastRow="0" w:firstColumn="0" w:lastColumn="0" w:noHBand="0" w:noVBand="0" w:val="0020"/>
+        <w:tblBorders>
+          <w:top w:val="single" w:sz="4" w:color="D9D9D9"/>
+          <w:left w:val="single" w:sz="4" w:color="D9D9D9"/>
+          <w:bottom w:val="single" w:sz="4" w:color="D9D9D9"/>
+          <w:right w:val="single" w:sz="4" w:color="D9D9D9"/>
+          <w:insideH w:val="single" w:sz="4" w:color="D9D9D9"/>
+          <w:insideV w:val="single" w:sz="4" w:color="D9D9D9"/>
+        </w:tblBorders>
       </w:tblPr>
       <w:tblGrid>
-        <w:gridCol w:w="2376"/>
-        <w:gridCol w:w="2376"/>
-        <w:gridCol w:w="3168"/>
+        <w:gridCol w:w="737"/>
+        <w:gridCol w:w="7030"/>
+        <w:gridCol w:w="1474"/>
       </w:tblGrid>
       <w:tr>
         <w:trPr>
           <w:tblHeader w:val="on"/>
         </w:trPr>
         <w:tc>
-          <w:tcPr/>
+          <w:tcPr>
+            <w:tcW w:type="dxa" w:w="737"/>
+          </w:tcPr>
           <w:p>
             <w:pPr>
               <w:pStyle w:val="Compact"/>
@@ -620,7 +640,9 @@
           </w:p>
         </w:tc>
         <w:tc>
-          <w:tcPr/>
+          <w:tcPr>
+            <w:tcW w:type="dxa" w:w="7030"/>
+          </w:tcPr>
           <w:p>
             <w:pPr>
               <w:pStyle w:val="Compact"/>
@@ -631,7 +653,9 @@
           </w:p>
         </w:tc>
         <w:tc>
-          <w:tcPr/>
+          <w:tcPr>
+            <w:tcW w:type="dxa" w:w="1474"/>
+          </w:tcPr>
           <w:p>
             <w:pPr>
               <w:pStyle w:val="Compact"/>
@@ -645,7 +669,9 @@
       </w:tr>
       <w:tr>
         <w:tc>
-          <w:tcPr/>
+          <w:tcPr>
+            <w:tcW w:type="dxa" w:w="737"/>
+          </w:tcPr>
           <w:p>
             <w:pPr>
               <w:pStyle w:val="Compact"/>
@@ -656,7 +682,9 @@
           </w:p>
         </w:tc>
         <w:tc>
-          <w:tcPr/>
+          <w:tcPr>
+            <w:tcW w:type="dxa" w:w="7030"/>
+          </w:tcPr>
           <w:p>
             <w:pPr>
               <w:pStyle w:val="Compact"/>
@@ -667,7 +695,9 @@
           </w:p>
         </w:tc>
         <w:tc>
-          <w:tcPr/>
+          <w:tcPr>
+            <w:tcW w:type="dxa" w:w="1474"/>
+          </w:tcPr>
           <w:p>
             <w:pPr>
               <w:pStyle w:val="Compact"/>
@@ -681,7 +711,9 @@
       </w:tr>
       <w:tr>
         <w:tc>
-          <w:tcPr/>
+          <w:tcPr>
+            <w:tcW w:type="dxa" w:w="737"/>
+          </w:tcPr>
           <w:p>
             <w:pPr>
               <w:pStyle w:val="Compact"/>
@@ -692,7 +724,9 @@
           </w:p>
         </w:tc>
         <w:tc>
-          <w:tcPr/>
+          <w:tcPr>
+            <w:tcW w:type="dxa" w:w="7030"/>
+          </w:tcPr>
           <w:p>
             <w:pPr>
               <w:pStyle w:val="Compact"/>
@@ -703,7 +737,9 @@
           </w:p>
         </w:tc>
         <w:tc>
-          <w:tcPr/>
+          <w:tcPr>
+            <w:tcW w:type="dxa" w:w="1474"/>
+          </w:tcPr>
           <w:p>
             <w:pPr>
               <w:pStyle w:val="Compact"/>
@@ -717,7 +753,9 @@
       </w:tr>
       <w:tr>
         <w:tc>
-          <w:tcPr/>
+          <w:tcPr>
+            <w:tcW w:type="dxa" w:w="737"/>
+          </w:tcPr>
           <w:p>
             <w:pPr>
               <w:pStyle w:val="Compact"/>
@@ -728,7 +766,9 @@
           </w:p>
         </w:tc>
         <w:tc>
-          <w:tcPr/>
+          <w:tcPr>
+            <w:tcW w:type="dxa" w:w="7030"/>
+          </w:tcPr>
           <w:p>
             <w:pPr>
               <w:pStyle w:val="Compact"/>
@@ -739,7 +779,9 @@
           </w:p>
         </w:tc>
         <w:tc>
-          <w:tcPr/>
+          <w:tcPr>
+            <w:tcW w:type="dxa" w:w="1474"/>
+          </w:tcPr>
           <w:p>
             <w:pPr>
               <w:pStyle w:val="Compact"/>
@@ -753,7 +795,9 @@
       </w:tr>
       <w:tr>
         <w:tc>
-          <w:tcPr/>
+          <w:tcPr>
+            <w:tcW w:type="dxa" w:w="737"/>
+          </w:tcPr>
           <w:p>
             <w:pPr>
               <w:pStyle w:val="Compact"/>
@@ -764,7 +808,9 @@
           </w:p>
         </w:tc>
         <w:tc>
-          <w:tcPr/>
+          <w:tcPr>
+            <w:tcW w:type="dxa" w:w="7030"/>
+          </w:tcPr>
           <w:p>
             <w:pPr>
               <w:pStyle w:val="Compact"/>
@@ -775,7 +821,9 @@
           </w:p>
         </w:tc>
         <w:tc>
-          <w:tcPr/>
+          <w:tcPr>
+            <w:tcW w:type="dxa" w:w="1474"/>
+          </w:tcPr>
           <w:p>
             <w:pPr>
               <w:pStyle w:val="Compact"/>
@@ -789,7 +837,9 @@
       </w:tr>
       <w:tr>
         <w:tc>
-          <w:tcPr/>
+          <w:tcPr>
+            <w:tcW w:type="dxa" w:w="737"/>
+          </w:tcPr>
           <w:p>
             <w:pPr>
               <w:pStyle w:val="Compact"/>
@@ -800,7 +850,9 @@
           </w:p>
         </w:tc>
         <w:tc>
-          <w:tcPr/>
+          <w:tcPr>
+            <w:tcW w:type="dxa" w:w="7030"/>
+          </w:tcPr>
           <w:p>
             <w:pPr>
               <w:pStyle w:val="Compact"/>
@@ -811,7 +863,9 @@
           </w:p>
         </w:tc>
         <w:tc>
-          <w:tcPr/>
+          <w:tcPr>
+            <w:tcW w:type="dxa" w:w="1474"/>
+          </w:tcPr>
           <w:p>
             <w:pPr>
               <w:pStyle w:val="Compact"/>
@@ -825,7 +879,9 @@
       </w:tr>
       <w:tr>
         <w:tc>
-          <w:tcPr/>
+          <w:tcPr>
+            <w:tcW w:type="dxa" w:w="737"/>
+          </w:tcPr>
           <w:p>
             <w:pPr>
               <w:pStyle w:val="Compact"/>
@@ -836,7 +892,9 @@
           </w:p>
         </w:tc>
         <w:tc>
-          <w:tcPr/>
+          <w:tcPr>
+            <w:tcW w:type="dxa" w:w="7030"/>
+          </w:tcPr>
           <w:p>
             <w:pPr>
               <w:pStyle w:val="Compact"/>
@@ -847,7 +905,9 @@
           </w:p>
         </w:tc>
         <w:tc>
-          <w:tcPr/>
+          <w:tcPr>
+            <w:tcW w:type="dxa" w:w="1474"/>
+          </w:tcPr>
           <w:p>
             <w:pPr>
               <w:pStyle w:val="Compact"/>
@@ -861,7 +921,9 @@
       </w:tr>
       <w:tr>
         <w:tc>
-          <w:tcPr/>
+          <w:tcPr>
+            <w:tcW w:type="dxa" w:w="737"/>
+          </w:tcPr>
           <w:p>
             <w:pPr>
               <w:pStyle w:val="Compact"/>
@@ -872,7 +934,9 @@
           </w:p>
         </w:tc>
         <w:tc>
-          <w:tcPr/>
+          <w:tcPr>
+            <w:tcW w:type="dxa" w:w="7030"/>
+          </w:tcPr>
           <w:p>
             <w:pPr>
               <w:pStyle w:val="Compact"/>
@@ -883,7 +947,9 @@
           </w:p>
         </w:tc>
         <w:tc>
-          <w:tcPr/>
+          <w:tcPr>
+            <w:tcW w:type="dxa" w:w="1474"/>
+          </w:tcPr>
           <w:p>
             <w:pPr>
               <w:pStyle w:val="Compact"/>
@@ -928,8 +994,8 @@
         <w:t xml:space="preserve">3.7 Sonderwünsche werden nicht außerhalb des MaBV-Ratenplans als Vorauszahlung abgerechnet. Werden sie vor Ausführung vereinbart, werden sie entweder in den Kaufpreis und die verbleibenden Raten einbezogen oder erst nach Ausführung und Abnahme des Sonderwunsches fällig.</w:t>
       </w:r>
     </w:p>
-    <w:bookmarkEnd w:id="14"/>
-    <w:bookmarkStart w:id="15" w:name="finanzierungsvollmacht"/>
+    <w:bookmarkEnd w:id="15"/>
+    <w:bookmarkStart w:id="16" w:name="finanzierungsvollmacht"/>
     <w:p>
       <w:pPr>
         <w:pStyle w:val="Heading2"/>
@@ -962,8 +1028,8 @@
         <w:t xml:space="preserve">4.3 Die Kosten der Finanzierungsgrundpfandrechte trägt die Käuferin. Kosten der Lastenfreistellung der Globalgrundschuld der Verkäuferin trägt die Verkäuferin.</w:t>
       </w:r>
     </w:p>
-    <w:bookmarkEnd w:id="15"/>
-    <w:bookmarkStart w:id="16" w:name="baupflicht-bausoll-unterlagen"/>
+    <w:bookmarkEnd w:id="16"/>
+    <w:bookmarkStart w:id="17" w:name="baupflicht-bausoll-unterlagen"/>
     <w:p>
       <w:pPr>
         <w:pStyle w:val="Heading2"/>
@@ -1136,8 +1202,8 @@
         <w:t xml:space="preserve">5.7 Sonderwünsche werden in einer gesonderten Nachtragsvereinbarung mit Leistungsbeschreibung, Preis, Auswirkung auf Termine, Gewährleistung und Schnittstellen festgelegt. Die Verkäuferin darf einen Sonderwunsch ablehnen, wenn er Bauablauf, Genehmigung, Statik, Schall, Brand, Energie, Gewährleistung oder Rechte anderer Erwerber beeinträchtigt.</w:t>
       </w:r>
     </w:p>
-    <w:bookmarkEnd w:id="16"/>
-    <w:bookmarkStart w:id="17" w:name="fertigstellung-verzug-vertragsstrafe"/>
+    <w:bookmarkEnd w:id="17"/>
+    <w:bookmarkStart w:id="18" w:name="fertigstellung-verzug-vertragsstrafe"/>
     <w:p>
       <w:pPr>
         <w:pStyle w:val="Heading2"/>
@@ -1186,8 +1252,8 @@
         <w:t xml:space="preserve">6.5 Termine verschieben sich nicht durch pauschale Hinweise auf Lieferketten, Wetter, Krankheit oder Marktlage. Eine Terminverschiebung kommt nur in Betracht, wenn die Verkäuferin unverzüglich informiert, die konkrete Bauablaufstörung darlegt und zumutbare Beschleunigungs- und Ersatzmaßnahmen ergreift.</w:t>
       </w:r>
     </w:p>
-    <w:bookmarkEnd w:id="17"/>
-    <w:bookmarkStart w:id="18" w:name="besitzübergabe-abnahme"/>
+    <w:bookmarkEnd w:id="18"/>
+    <w:bookmarkStart w:id="19" w:name="besitzübergabe-abnahme"/>
     <w:p>
       <w:pPr>
         <w:pStyle w:val="Heading2"/>
@@ -1244,8 +1310,8 @@
         <w:t xml:space="preserve">7.6 Verweigert die Käuferin die Abnahme unter Angabe mindestens eines Mangels, findet keine Abnahmefiktion statt. Bei Verbrauchern weist die Verkäuferin in einer etwaigen Aufforderung zur Abnahme in Textform klar auf die Rechtsfolgen einer nicht erklärten oder ohne Mangelangabe verweigerten Abnahme hin.</w:t>
       </w:r>
     </w:p>
-    <w:bookmarkEnd w:id="18"/>
-    <w:bookmarkStart w:id="19" w:name="mängelrechte-verjährung-selbstvornahme"/>
+    <w:bookmarkEnd w:id="19"/>
+    <w:bookmarkStart w:id="20" w:name="mängelrechte-verjährung-selbstvornahme"/>
     <w:p>
       <w:pPr>
         <w:pStyle w:val="Heading2"/>
@@ -1294,8 +1360,8 @@
         <w:t xml:space="preserve">8.5 Die Gemeinschaft der Wohnungseigentümer übt nach § 9a Abs. 2 WEG die sich aus dem gemeinschaftlichen Eigentum ergebenden Rechte sowie solche Rechte der Wohnungseigentümer aus, die eine einheitliche Rechtsverfolgung erfordern. Die individuellen Abnahme- und Vorbehaltsrechte der Käuferin werden dadurch nicht ausgeschlossen.</w:t>
       </w:r>
     </w:p>
-    <w:bookmarkEnd w:id="19"/>
-    <w:bookmarkStart w:id="20" w:name="X4e7b9c7bc4ba1eaccb7ae4b385f6db8461125a6"/>
+    <w:bookmarkEnd w:id="20"/>
+    <w:bookmarkStart w:id="21" w:name="X4e7b9c7bc4ba1eaccb7ae4b385f6db8461125a6"/>
     <w:p>
       <w:pPr>
         <w:pStyle w:val="Heading2"/>
@@ -1336,8 +1402,8 @@
         <w:t xml:space="preserve">9.4 Die Verkäuferin übergibt der Gemeinschaft die für Betrieb, Wartung und Verwaltung erforderliche geordnete Projektdokumentation spätestens mit Fertigstellung des jeweiligen gemeinschaftlichen Anlagenteils, keinesfalls später als bei dessen Besitzübergabe. Sie umfasst Wartungsverträge, Gewährleistungsübersicht, Prüfprotokolle, Revisionsunterlagen und Kontaktdaten der ausführenden Unternehmen; frühere Herausgabezeitpunkte nach § 5.2 bleiben unberührt.</w:t>
       </w:r>
     </w:p>
-    <w:bookmarkEnd w:id="20"/>
-    <w:bookmarkStart w:id="21" w:name="X0ce4c3bf0f91ec43ae492607ab14ef0476b64ee"/>
+    <w:bookmarkEnd w:id="21"/>
+    <w:bookmarkStart w:id="22" w:name="X0ce4c3bf0f91ec43ae492607ab14ef0476b64ee"/>
     <w:p>
       <w:pPr>
         <w:pStyle w:val="Heading2"/>
@@ -1378,8 +1444,8 @@
         <w:t xml:space="preserve">10.4 Die Parteien sind über den Eigentumsübergang einig. Sie bewilligen und beantragen die Eigentumsumschreibung auf die Käuferin. Die Notarin wird angewiesen, die Eigentumsumschreibung erst zu beantragen, wenn der Kaufpreis fällig und gezahlt oder hinsichtlich streitiger Restbeträge berechtigt hinterlegt oder gesichert ist, die steuerliche Unbedenklichkeitsbescheinigung vorliegt und die Lastenfreistellung gesichert ist.</w:t>
       </w:r>
     </w:p>
-    <w:bookmarkEnd w:id="21"/>
-    <w:bookmarkStart w:id="22" w:name="rücktritt-rückabwicklung-insolvenzrisiko"/>
+    <w:bookmarkEnd w:id="22"/>
+    <w:bookmarkStart w:id="23" w:name="rücktritt-rückabwicklung-insolvenzrisiko"/>
     <w:p>
       <w:pPr>
         <w:pStyle w:val="Heading2"/>
@@ -1412,8 +1478,8 @@
         <w:t xml:space="preserve">11.3 Wird nach Vertragsschluss erkennbar, dass der Anspruch der vorleistungspflichtigen Käuferin auf die Gegenleistung durch mangelnde Leistungsfähigkeit der Verkäuferin gefährdet wird, kann die Käuferin ihre Leistung nach § 321 BGB verweigern, bis die Gegenleistung bewirkt oder hierfür Sicherheit geleistet wird. Bloße Gerüchte oder allgemeine Marktlagen genügen nicht. Gesetzliche Rechte im Insolvenzfall bleiben unberührt.</w:t>
       </w:r>
     </w:p>
-    <w:bookmarkEnd w:id="22"/>
-    <w:bookmarkStart w:id="23" w:name="datenschutz-kommunikation-zustellungen"/>
+    <w:bookmarkEnd w:id="23"/>
+    <w:bookmarkStart w:id="24" w:name="datenschutz-kommunikation-zustellungen"/>
     <w:p>
       <w:pPr>
         <w:pStyle w:val="Heading2"/>
@@ -1438,8 +1504,8 @@
         <w:t xml:space="preserve">12.2 Die Verkäuferin verarbeitet personenbezogene Daten der Käuferin nur zur Vorbereitung, Durchführung und Abwicklung dieses Vertrags, zur Erfüllung gesetzlicher Pflichten und zur ordnungsgemäßen Verwaltung der Gemeinschaft. Eine Weitergabe an Planer, Bauleitung, Verwaltung, Bank, Notariat und Behörden erfolgt nur, soweit dies hierfür erforderlich ist.</w:t>
       </w:r>
     </w:p>
-    <w:bookmarkEnd w:id="23"/>
-    <w:bookmarkStart w:id="24" w:name="schlussbestimmungen-belehrungen-kosten"/>
+    <w:bookmarkEnd w:id="24"/>
+    <w:bookmarkStart w:id="25" w:name="schlussbestimmungen-belehrungen-kosten"/>
     <w:p>
       <w:pPr>
         <w:pStyle w:val="Heading2"/>
@@ -1469,7 +1535,7 @@
         <w:pStyle w:val="BodyText"/>
       </w:pPr>
       <w:r>
-        <w:t xml:space="preserve">13.3 Die Notarin belehrte insbesondere über die Wirkungen der Auflassungsvormerkung, die MaBV-Fälligkeitsvoraussetzungen, den 5-%-Sicherheitseinbehalt, die Bedeutung der Abnahme, die Mängelverjährung, die Lastenfreistellung, die Grunderwerbsteuer, die Eigentumsumschreibung und die Bedeutung der mitbeurkundeten Baubeschreibung.</w:t>
+        <w:t xml:space="preserve">13.3 Im Beurkundungstermin soll die Notarin insbesondere über die Wirkungen der Auflassungsvormerkung, die MaBV-Fälligkeitsvoraussetzungen, den 5-%-Sicherheitseinbehalt, die Bedeutung der Abnahme, die Mängelverjährung, die Lastenfreistellung, die Grunderwerbsteuer, die Eigentumsumschreibung und die Bedeutung der zur Mitbeurkundung vorgesehenen Baubeschreibung belehren.</w:t>
       </w:r>
     </w:p>
     <w:p>
@@ -1488,8 +1554,8 @@
         <w:t xml:space="preserve">13.5 Der Geschäftswert dieser Urkunde beträgt 742.000,00 EUR.</w:t>
       </w:r>
     </w:p>
-    <w:bookmarkEnd w:id="24"/>
-    <w:bookmarkStart w:id="25" w:name="auflassung"/>
+    <w:bookmarkEnd w:id="25"/>
+    <w:bookmarkStart w:id="26" w:name="auflassung"/>
     <w:p>
       <w:pPr>
         <w:pStyle w:val="Heading2"/>
@@ -1506,8 +1572,8 @@
         <w:t xml:space="preserve">Die Verkäuferin und die Käuferin sind darüber einig, dass das Eigentum an dem in § 1 bezeichneten Wohnungseigentum auf die Käuferin übergeht. Die Eintragung des Eigentumswechsels im Grundbuch wird bewilligt und beantragt. Die Notarin wird angewiesen, den Antrag nach Maßgabe des § 10.4 einzureichen.</w:t>
       </w:r>
     </w:p>
-    <w:bookmarkEnd w:id="25"/>
-    <w:bookmarkStart w:id="26" w:name="vorlesen-genehmigung-ausfertigungen"/>
+    <w:bookmarkEnd w:id="26"/>
+    <w:bookmarkStart w:id="27" w:name="vorlesen-genehmigung-ausfertigungen"/>
     <w:p>
       <w:pPr>
         <w:pStyle w:val="Heading2"/>
@@ -1521,15 +1587,15 @@
         <w:pStyle w:val="FirstParagraph"/>
       </w:pPr>
       <w:r>
-        <w:t xml:space="preserve">Diese Niederschrift wurde den Erschienenen von der Notarin vorgelesen, von ihnen genehmigt und eigenhändig unterschrieben.</w:t>
-      </w:r>
-    </w:p>
-    <w:p>
-      <w:pPr>
-        <w:pStyle w:val="BodyText"/>
-      </w:pPr>
-      <w:r>
-        <w:t xml:space="preserve">Köln, den 18. September 2026</w:t>
+        <w:t xml:space="preserve">Verlesung, Genehmigung und Unterzeichnung dieser Niederschrift einschließlich der Anlage Baubeschreibung stehen noch aus. Die nachstehenden Unterschriftsfelder bleiben im Entwurf frei.</w:t>
+      </w:r>
+    </w:p>
+    <w:p>
+      <w:pPr>
+        <w:pStyle w:val="BodyText"/>
+      </w:pPr>
+      <w:r>
+        <w:t xml:space="preserve">Ort und Datum: ____________________</w:t>
       </w:r>
     </w:p>
     <w:p>
@@ -1576,9 +1642,9 @@
         <w:t xml:space="preserve">Dr. Miriam Falkenried, Notarin</w:t>
       </w:r>
     </w:p>
-    <w:bookmarkEnd w:id="26"/>
     <w:bookmarkEnd w:id="27"/>
-    <w:bookmarkStart w:id="40" w:name="anlage-baubeschreibung"/>
+    <w:bookmarkEnd w:id="28"/>
+    <w:bookmarkStart w:id="41" w:name="anlage-baubeschreibung"/>
     <w:p>
       <w:pPr>
         <w:pStyle w:val="Heading1"/>
@@ -1588,7 +1654,19 @@
         <w:t xml:space="preserve">Anlage: Baubeschreibung</w:t>
       </w:r>
     </w:p>
-    <w:bookmarkStart w:id="28" w:name="bauvorhaben-und-planstand"/>
+    <w:p>
+      <w:pPr>
+        <w:pStyle w:val="FirstParagraph"/>
+      </w:pPr>
+      <w:r>
+        <w:rPr>
+          <w:b/>
+          <w:bCs/>
+        </w:rPr>
+        <w:t xml:space="preserve">ENTWURF</w:t>
+      </w:r>
+    </w:p>
+    <w:bookmarkStart w:id="29" w:name="bauvorhaben-und-planstand"/>
     <w:p>
       <w:pPr>
         <w:pStyle w:val="Heading2"/>
@@ -1647,11 +1725,11 @@
         <w:pStyle w:val="BodyText"/>
       </w:pPr>
       <w:r>
-        <w:t xml:space="preserve">Diese Baubeschreibung ist mit dem Bauträgervertrag mitbeurkundet und bestimmt das Bausoll für die Einheit B-05 sowie das für ihre Nutzung erforderliche Gemeinschaftseigentum.</w:t>
-      </w:r>
-    </w:p>
-    <w:bookmarkEnd w:id="28"/>
-    <w:bookmarkStart w:id="29" w:name="grundstück-erschließung-außenanlagen"/>
+        <w:t xml:space="preserve">Diese Baubeschreibung ist zur Mitbeurkundung mit dem Bauträgervertrag vorgesehen und bestimmt das Bausoll für die Einheit B-05 sowie das für ihre Nutzung erforderliche Gemeinschaftseigentum.</w:t>
+      </w:r>
+    </w:p>
+    <w:bookmarkEnd w:id="29"/>
+    <w:bookmarkStart w:id="30" w:name="grundstück-erschließung-außenanlagen"/>
     <w:p>
       <w:pPr>
         <w:pStyle w:val="Heading2"/>
@@ -1684,8 +1762,8 @@
         <w:t xml:space="preserve">1.3 Das Dach erhält ein Retentionsgründach mit Photovoltaikanlage zur Versorgung gemeinschaftlicher Verbraucher und nach Maßgabe des Messkonzepts anteilig der Wohnungen. Einzelheiten der Abrechnung werden in der Gemeinschaftsordnung und im späteren Betreiberkonzept beschrieben.</w:t>
       </w:r>
     </w:p>
-    <w:bookmarkEnd w:id="29"/>
-    <w:bookmarkStart w:id="30" w:name="baugrund-gründung-abdichtung"/>
+    <w:bookmarkEnd w:id="30"/>
+    <w:bookmarkStart w:id="31" w:name="baugrund-gründung-abdichtung"/>
     <w:p>
       <w:pPr>
         <w:pStyle w:val="Heading2"/>
@@ -1718,8 +1796,8 @@
         <w:t xml:space="preserve">2.3 Die Verkäuferin dokumentiert Abdichtungsarbeiten durch Ausführungsunterlagen, Fotodokumentation wesentlicher Arbeitsschritte und Fachunternehmererklärung.</w:t>
       </w:r>
     </w:p>
-    <w:bookmarkEnd w:id="30"/>
-    <w:bookmarkStart w:id="31" w:name="konstruktion-gebäudehülle"/>
+    <w:bookmarkEnd w:id="31"/>
+    <w:bookmarkStart w:id="32" w:name="konstruktion-gebäudehülle"/>
     <w:p>
       <w:pPr>
         <w:pStyle w:val="Heading2"/>
@@ -1760,8 +1838,8 @@
         <w:t xml:space="preserve">3.4 Wohnungseingangstür: dichtschließende Tür mit erhöhtem Schallschutz, Mehrfachverriegelung, Spion, Sicherheitsbeschlag und einheitlicher Oberfläche nach Bemusterungslinie Lindenhain Komfort.</w:t>
       </w:r>
     </w:p>
-    <w:bookmarkEnd w:id="31"/>
-    <w:bookmarkStart w:id="32" w:name="energie-heizung-lüftung-sanitär"/>
+    <w:bookmarkEnd w:id="32"/>
+    <w:bookmarkStart w:id="33" w:name="energie-heizung-lüftung-sanitär"/>
     <w:p>
       <w:pPr>
         <w:pStyle w:val="Heading2"/>
@@ -1802,8 +1880,8 @@
         <w:t xml:space="preserve">4.4 Bad und Gäste-WC erhalten weiße Sanitärobjekte der Bemusterungslinie Lindenhain Komfort, bodengleiche Dusche im Bad, Waschtisch, wandhängendes WC, verchromte Armaturen eines Markenherstellers und Handtuchheizkörper elektrisch oder warmwassergeführt nach Planung.</w:t>
       </w:r>
     </w:p>
-    <w:bookmarkEnd w:id="32"/>
-    <w:bookmarkStart w:id="33" w:name="elektro-medien-sicherheit"/>
+    <w:bookmarkEnd w:id="33"/>
+    <w:bookmarkStart w:id="34" w:name="elektro-medien-sicherheit"/>
     <w:p>
       <w:pPr>
         <w:pStyle w:val="Heading2"/>
@@ -1836,8 +1914,8 @@
         <w:t xml:space="preserve">5.3 Gemeinschaftsbereiche erhalten energiesparende Beleuchtung, Bewegungsmelder in Fluren, Keller und Tiefgarage sowie eine ausreichend beleuchtete Hausnummer und Klingelanlage.</w:t>
       </w:r>
     </w:p>
-    <w:bookmarkEnd w:id="33"/>
-    <w:bookmarkStart w:id="34" w:name="innenausbau-oberflächen-türen"/>
+    <w:bookmarkEnd w:id="34"/>
+    <w:bookmarkStart w:id="35" w:name="innenausbau-oberflächen-türen"/>
     <w:p>
       <w:pPr>
         <w:pStyle w:val="Heading2"/>
@@ -1878,8 +1956,8 @@
         <w:t xml:space="preserve">6.4 Balkon oder Loggia der Einheit B-05 wird mit frostsicherem Belag, Entwässerung, Außensteckdose und Außenleuchte hergestellt.</w:t>
       </w:r>
     </w:p>
-    <w:bookmarkEnd w:id="34"/>
-    <w:bookmarkStart w:id="35" w:name="schallschutz-brandschutz-barrierearmut"/>
+    <w:bookmarkEnd w:id="35"/>
+    <w:bookmarkStart w:id="36" w:name="schallschutz-brandschutz-barrierearmut"/>
     <w:p>
       <w:pPr>
         <w:pStyle w:val="Heading2"/>
@@ -1912,8 +1990,8 @@
         <w:t xml:space="preserve">7.3 Der Hauszugang, der Aufzug, die Flure und die Wohnung B-05 werden barrierearm nutzbar ausgeführt. Eine vollständige Barrierefreiheit nach DIN 18040 ist nur geschuldet, soweit sie ausdrücklich in den Plänen bezeichnet ist.</w:t>
       </w:r>
     </w:p>
-    <w:bookmarkEnd w:id="35"/>
-    <w:bookmarkStart w:id="36" w:name="X2886e964c029d0082887e07f9ac0c09187785e3"/>
+    <w:bookmarkEnd w:id="36"/>
+    <w:bookmarkStart w:id="37" w:name="X2886e964c029d0082887e07f9ac0c09187785e3"/>
     <w:p>
       <w:pPr>
         <w:pStyle w:val="Heading2"/>
@@ -1946,8 +2024,8 @@
         <w:t xml:space="preserve">8.3 Fahrradraum, Kinderwagenraum, Müllraum und Paketstation werden spätestens bei Bezugsfertigkeit nutzbar hergestellt.</w:t>
       </w:r>
     </w:p>
-    <w:bookmarkEnd w:id="36"/>
-    <w:bookmarkStart w:id="37" w:name="bemusterung-auswahlrechte"/>
+    <w:bookmarkEnd w:id="37"/>
+    <w:bookmarkStart w:id="38" w:name="bemusterung-auswahlrechte"/>
     <w:p>
       <w:pPr>
         <w:pStyle w:val="Heading2"/>
@@ -1980,8 +2058,8 @@
         <w:t xml:space="preserve">9.3 Sonderwünsche außerhalb der Bemusterungslinie werden nur nach schriftlicher Beschreibung, Preisangabe, Terminfolge und technischer Prüfung ausgeführt.</w:t>
       </w:r>
     </w:p>
-    <w:bookmarkEnd w:id="37"/>
-    <w:bookmarkStart w:id="38" w:name="unterlagen-wartung-übergabe"/>
+    <w:bookmarkEnd w:id="38"/>
+    <w:bookmarkStart w:id="39" w:name="unterlagen-wartung-übergabe"/>
     <w:p>
       <w:pPr>
         <w:pStyle w:val="Heading2"/>
@@ -2014,8 +2092,8 @@
         <w:t xml:space="preserve">10.3 Wartungsbedürftige Anlagen werden so beschrieben, dass die Gemeinschaft nach Übergabe eigenständig Wartungsverträge prüfen, übernehmen oder neu vergeben kann.</w:t>
       </w:r>
     </w:p>
-    <w:bookmarkEnd w:id="38"/>
-    <w:bookmarkStart w:id="39" w:name="fertigstellung-der-baubeschreibung"/>
+    <w:bookmarkEnd w:id="39"/>
+    <w:bookmarkStart w:id="40" w:name="fertigstellung-der-baubeschreibung"/>
     <w:p>
       <w:pPr>
         <w:pStyle w:val="Heading2"/>
@@ -2048,12 +2126,15 @@
         <w:t xml:space="preserve">Lindenhain Wohnwerte GmbH &amp; Co. KG</w:t>
       </w:r>
     </w:p>
-    <w:bookmarkEnd w:id="39"/>
     <w:bookmarkEnd w:id="40"/>
+    <w:bookmarkEnd w:id="41"/>
     <w:sectPr>
+      <w:headerReference w:type="default" r:id="rId9"/>
       <w:footnotePr>
         <w:numRestart w:val="eachSect"/>
       </w:footnotePr>
+      <w:pgSz w:w="11906" w:h="16838"/>
+      <w:pgMar w:top="1247" w:bottom="1247" w:left="1417" w:right="1247"/>
     </w:sectPr>
   </w:body>
 </w:document>
@@ -2080,6 +2161,23 @@
     </w:p>
   </w:footnote>
 </w:footnotes>
+</file>
+
+<file path=word/header1.xml><?xml version="1.0" encoding="utf-8"?>
+<w:hdr xmlns:m="http://schemas.openxmlformats.org/officeDocument/2006/math" xmlns:mc="http://schemas.openxmlformats.org/markup-compatibility/2006" xmlns:mo="http://schemas.microsoft.com/office/mac/office/2008/main" xmlns:mv="urn:schemas-microsoft-com:mac:vml" xmlns:o="urn:schemas-microsoft-com:office:office" xmlns:r="http://schemas.openxmlformats.org/officeDocument/2006/relationships" xmlns:v="urn:schemas-microsoft-com:vml" xmlns:w10="urn:schemas-microsoft-com:office:word" xmlns:w14="http://schemas.microsoft.com/office/word/2010/wordml" xmlns:w="http://schemas.openxmlformats.org/wordprocessingml/2006/main" xmlns:wne="http://schemas.microsoft.com/office/word/2006/wordml" xmlns:wp14="http://schemas.microsoft.com/office/word/2010/wordprocessingDrawing" xmlns:wp="http://schemas.openxmlformats.org/drawingml/2006/wordprocessingDrawing" xmlns:wpc="http://schemas.microsoft.com/office/word/2010/wordprocessingCanvas" xmlns:wpg="http://schemas.microsoft.com/office/word/2010/wordprocessingGroup" xmlns:wpi="http://schemas.microsoft.com/office/word/2010/wordprocessingInk" xmlns:wps="http://schemas.microsoft.com/office/word/2010/wordprocessingShape" mc:Ignorable="w14 wp14">
+  <w:p>
+    <w:pPr>
+      <w:pStyle w:val="Header"/>
+    </w:pPr>
+    <w:r>
+      <w:rPr>
+        <w:b/>
+        <w:sz w:val="18"/>
+      </w:rPr>
+      <w:t>ENTWURF</w:t>
+    </w:r>
+  </w:p>
+</w:hdr>
 </file>
 
 <file path=word/numbering.xml><?xml version="1.0" encoding="utf-8"?>
@@ -2296,6 +2394,14 @@
   <w:style w:default="1" w:styleId="Normal" w:type="paragraph">
     <w:name w:val="Normal"/>
     <w:qFormat/>
+    <w:pPr>
+      <w:spacing w:line="269" w:lineRule="auto"/>
+    </w:pPr>
+    <w:rPr>
+      <w:rFonts w:ascii="Times New Roman" w:hAnsi="Times New Roman"/>
+      <w:color w:val="000000"/>
+      <w:sz w:val="22"/>
+    </w:rPr>
   </w:style>
   <w:style w:styleId="BodyText" w:type="paragraph">
     <w:name w:val="Body Text"/>
@@ -2305,12 +2411,18 @@
     <w:pPr>
       <w:spacing w:after="180" w:before="180"/>
     </w:pPr>
+    <w:rPr>
+      <w:color w:val="000000"/>
+    </w:rPr>
   </w:style>
   <w:style w:customStyle="1" w:styleId="FirstParagraph" w:type="paragraph">
     <w:name w:val="First Paragraph"/>
     <w:basedOn w:val="BodyText"/>
     <w:next w:val="BodyText"/>
     <w:qFormat/>
+    <w:rPr>
+      <w:color w:val="000000"/>
+    </w:rPr>
   </w:style>
   <w:style w:customStyle="1" w:styleId="Compact" w:type="paragraph">
     <w:name w:val="Compact"/>
@@ -2319,6 +2431,9 @@
     <w:pPr>
       <w:spacing w:after="36" w:before="36"/>
     </w:pPr>
+    <w:rPr>
+      <w:color w:val="000000"/>
+    </w:rPr>
   </w:style>
   <w:style w:styleId="Title" w:type="paragraph">
     <w:name w:val="Title"/>
@@ -2335,6 +2450,7 @@
     </w:pPr>
     <w:rPr>
       <w:rFonts w:asciiTheme="majorHAnsi" w:cstheme="majorBidi" w:eastAsiaTheme="majorEastAsia" w:hAnsiTheme="majorHAnsi"/>
+      <w:color w:val="000000"/>
       <w:sz w:val="56"/>
       <w:szCs w:val="56"/>
     </w:rPr>
@@ -2366,6 +2482,7 @@
     </w:pPr>
     <w:rPr>
       <w:rFonts w:cstheme="majorBidi" w:eastAsiaTheme="majorEastAsia"/>
+      <w:color w:val="000000"/>
       <w:spacing w:val="15"/>
       <w:sz w:val="28"/>
       <w:szCs w:val="28"/>
@@ -2395,6 +2512,7 @@
       <w:keepLines/>
     </w:pPr>
     <w:rPr>
+      <w:color w:val="000000"/>
       <w:sz w:val="24"/>
       <w:szCs w:val="24"/>
     </w:rPr>
@@ -2409,6 +2527,7 @@
       <w:keepLines/>
     </w:pPr>
     <w:rPr>
+      <w:color w:val="000000"/>
       <w:sz w:val="24"/>
       <w:szCs w:val="24"/>
     </w:rPr>
@@ -2426,6 +2545,7 @@
     </w:pPr>
     <w:rPr>
       <w:b/>
+      <w:color w:val="000000"/>
       <w:sz w:val="20"/>
       <w:szCs w:val="20"/>
     </w:rPr>
@@ -2441,6 +2561,7 @@
       <w:spacing w:after="300" w:before="100"/>
     </w:pPr>
     <w:rPr>
+      <w:color w:val="000000"/>
       <w:sz w:val="20"/>
       <w:szCs w:val="20"/>
     </w:rPr>
@@ -2451,7 +2572,9 @@
     <w:next w:val="Bibliography"/>
     <w:qFormat/>
     <w:pPr/>
-    <w:rPr/>
+    <w:rPr>
+      <w:color w:val="000000"/>
+    </w:rPr>
   </w:style>
   <w:style w:styleId="Heading1" w:type="paragraph">
     <w:name w:val="heading 1"/>
@@ -2469,7 +2592,7 @@
     </w:pPr>
     <w:rPr>
       <w:rFonts w:asciiTheme="majorHAnsi" w:cstheme="majorBidi" w:eastAsiaTheme="majorEastAsia" w:hAnsiTheme="majorHAnsi"/>
-      <w:color w:themeColor="accent1" w:themeShade="BF" w:val="0F4761"/>
+      <w:color w:val="000000"/>
       <w:sz w:val="40"/>
       <w:szCs w:val="40"/>
     </w:rPr>
@@ -2492,7 +2615,7 @@
     </w:pPr>
     <w:rPr>
       <w:rFonts w:asciiTheme="majorHAnsi" w:cstheme="majorBidi" w:eastAsiaTheme="majorEastAsia" w:hAnsiTheme="majorHAnsi"/>
-      <w:color w:themeColor="accent1" w:themeShade="BF" w:val="0F4761"/>
+      <w:color w:val="000000"/>
       <w:sz w:val="32"/>
       <w:szCs w:val="32"/>
     </w:rPr>
@@ -2515,7 +2638,7 @@
     </w:pPr>
     <w:rPr>
       <w:rFonts w:cstheme="majorBidi" w:eastAsiaTheme="majorEastAsia"/>
-      <w:color w:themeColor="accent1" w:themeShade="BF" w:val="0F4761"/>
+      <w:color w:val="000000"/>
       <w:sz w:val="28"/>
       <w:szCs w:val="28"/>
     </w:rPr>
@@ -2540,7 +2663,7 @@
       <w:rFonts w:cstheme="majorBidi" w:eastAsiaTheme="majorEastAsia"/>
       <w:i/>
       <w:iCs/>
-      <w:color w:themeColor="accent1" w:themeShade="BF" w:val="0F4761"/>
+      <w:color w:val="000000"/>
     </w:rPr>
   </w:style>
   <w:style w:styleId="Heading5" w:type="paragraph">
@@ -2561,7 +2684,7 @@
     </w:pPr>
     <w:rPr>
       <w:rFonts w:cstheme="majorBidi" w:eastAsiaTheme="majorEastAsia"/>
-      <w:color w:themeColor="accent1" w:themeShade="BF" w:val="0F4761"/>
+      <w:color w:val="000000"/>
     </w:rPr>
   </w:style>
   <w:style w:styleId="Heading6" w:type="paragraph">
@@ -2584,7 +2707,7 @@
       <w:rFonts w:cstheme="majorBidi" w:eastAsiaTheme="majorEastAsia"/>
       <w:i/>
       <w:iCs/>
-      <w:color w:themeColor="text1" w:themeTint="A6" w:val="595959"/>
+      <w:color w:val="000000"/>
     </w:rPr>
   </w:style>
   <w:style w:styleId="Heading7" w:type="paragraph">
@@ -2605,7 +2728,7 @@
     </w:pPr>
     <w:rPr>
       <w:rFonts w:cstheme="majorBidi" w:eastAsiaTheme="majorEastAsia"/>
-      <w:color w:themeColor="text1" w:themeTint="A6" w:val="595959"/>
+      <w:color w:val="000000"/>
     </w:rPr>
   </w:style>
   <w:style w:styleId="Heading8" w:type="paragraph">
@@ -2628,7 +2751,7 @@
       <w:rFonts w:cstheme="majorBidi" w:eastAsiaTheme="majorEastAsia"/>
       <w:i/>
       <w:iCs/>
-      <w:color w:themeColor="text1" w:themeTint="D8" w:val="272727"/>
+      <w:color w:val="000000"/>
     </w:rPr>
   </w:style>
   <w:style w:styleId="Heading9" w:type="paragraph">
@@ -2649,7 +2772,7 @@
     </w:pPr>
     <w:rPr>
       <w:rFonts w:cstheme="majorBidi" w:eastAsiaTheme="majorEastAsia"/>
-      <w:color w:themeColor="text1" w:themeTint="D8" w:val="272727"/>
+      <w:color w:val="000000"/>
     </w:rPr>
   </w:style>
   <w:style w:customStyle="1" w:styleId="Heading1Char" w:type="character">
@@ -2782,6 +2905,9 @@
       <w:spacing w:after="100" w:before="100"/>
       <w:ind w:firstLine="0" w:left="480" w:right="480"/>
     </w:pPr>
+    <w:rPr>
+      <w:color w:val="000000"/>
+    </w:rPr>
   </w:style>
   <w:style w:styleId="FootnoteText" w:type="paragraph">
     <w:name w:val="Footnote Text"/>
@@ -2790,6 +2916,9 @@
     <w:uiPriority w:val="9"/>
     <w:unhideWhenUsed/>
     <w:qFormat/>
+    <w:rPr>
+      <w:color w:val="000000"/>
+    </w:rPr>
   </w:style>
   <w:style w:styleId="FootnoteBlockText" w:type="paragraph">
     <w:name w:val="Footnote Block Text"/>
@@ -2802,6 +2931,9 @@
       <w:spacing w:after="100" w:before="100"/>
       <w:ind w:firstLine="0" w:left="480" w:right="480"/>
     </w:pPr>
+    <w:rPr>
+      <w:color w:val="000000"/>
+    </w:rPr>
   </w:style>
   <w:style w:default="1" w:styleId="DefaultParagraphFont" w:type="character">
     <w:name w:val="Default Paragraph Font"/>
@@ -2843,11 +2975,15 @@
     </w:pPr>
     <w:rPr>
       <w:b/>
+      <w:color w:val="000000"/>
     </w:rPr>
   </w:style>
   <w:style w:customStyle="1" w:styleId="Definition" w:type="paragraph">
     <w:name w:val="Definition"/>
     <w:basedOn w:val="Normal"/>
+    <w:rPr>
+      <w:color w:val="000000"/>
+    </w:rPr>
   </w:style>
   <w:style w:styleId="Caption" w:type="paragraph">
     <w:name w:val="Caption"/>
@@ -2858,6 +2994,7 @@
     </w:pPr>
     <w:rPr>
       <w:i/>
+      <w:color w:val="000000"/>
     </w:rPr>
   </w:style>
   <w:style w:customStyle="1" w:styleId="TableCaption" w:type="paragraph">
@@ -2866,14 +3003,23 @@
     <w:pPr>
       <w:keepNext/>
     </w:pPr>
+    <w:rPr>
+      <w:color w:val="000000"/>
+    </w:rPr>
   </w:style>
   <w:style w:customStyle="1" w:styleId="ImageCaption" w:type="paragraph">
     <w:name w:val="Image Caption"/>
     <w:basedOn w:val="Caption"/>
+    <w:rPr>
+      <w:color w:val="000000"/>
+    </w:rPr>
   </w:style>
   <w:style w:customStyle="1" w:styleId="Figure" w:type="paragraph">
     <w:name w:val="Figure"/>
     <w:basedOn w:val="Normal"/>
+    <w:rPr>
+      <w:color w:val="000000"/>
+    </w:rPr>
   </w:style>
   <w:style w:customStyle="1" w:styleId="CaptionedFigure" w:type="paragraph">
     <w:name w:val="Captioned Figure"/>
@@ -2881,6 +3027,9 @@
     <w:pPr>
       <w:keepNext/>
     </w:pPr>
+    <w:rPr>
+      <w:color w:val="000000"/>
+    </w:rPr>
   </w:style>
   <w:style w:customStyle="1" w:styleId="BodyTextChar" w:type="character">
     <w:name w:val="Body Text Char"/>
@@ -2928,7 +3077,7 @@
       <w:rFonts w:asciiTheme="majorHAnsi" w:cstheme="majorBidi" w:eastAsiaTheme="majorEastAsia" w:hAnsiTheme="majorHAnsi"/>
       <w:b w:val="0"/>
       <w:bCs w:val="0"/>
-      <w:color w:themeColor="accent1" w:themeShade="BF" w:val="365F91"/>
+      <w:color w:val="000000"/>
     </w:rPr>
   </w:style>
   <w:style w:type="paragraph" w:customStyle="1" w:styleId="SourceCode">
@@ -2938,6 +3087,9 @@
     <w:pPr>
       <w:wordWrap w:val="off"/>
     </w:pPr>
+    <w:rPr>
+      <w:color w:val="000000"/>
+    </w:rPr>
   </w:style>
   <w:style w:type="character" w:customStyle="1" w:styleId="KeywordTok">
     <w:name w:val="KeywordTok"/>

</xml_diff>